<commit_message>
debugging: auth issues because supa went down and uncommitted files got lost
</commit_message>
<xml_diff>
--- a/docs/project_report.docx
+++ b/docs/project_report.docx
@@ -5,12 +5,13 @@
     <w:p>
       <w:pPr>
         <w:pStyle w:val="Normal"/>
+        <w:jc w:val="center"/>
         <w:rPr>
           <w:rFonts w:ascii="Times New Roman" w:hAnsi="Times New Roman" w:cs="Times New Roman"/>
           <w:b/>
           <w:bCs/>
-          <w:sz w:val="32"/>
-          <w:szCs w:val="32"/>
+          <w:sz w:val="28"/>
+          <w:szCs w:val="28"/>
         </w:rPr>
       </w:pPr>
       <w:r>
@@ -18,291 +19,8 @@
           <w:rFonts w:cs="Times New Roman" w:ascii="Times New Roman" w:hAnsi="Times New Roman"/>
           <w:b/>
           <w:bCs/>
-          <w:sz w:val="32"/>
-          <w:szCs w:val="32"/>
-        </w:rPr>
-        <w:t>Abstract </w:t>
-      </w:r>
-    </w:p>
-    <w:p>
-      <w:pPr>
-        <w:pStyle w:val="Normal"/>
-        <w:spacing w:lineRule="auto" w:line="276"/>
-        <w:rPr>
-          <w:rFonts w:ascii="Times New Roman" w:hAnsi="Times New Roman" w:cs="Times New Roman"/>
-        </w:rPr>
-      </w:pPr>
-      <w:r>
-        <w:rPr>
-          <w:rFonts w:cs="Times New Roman" w:ascii="Times New Roman" w:hAnsi="Times New Roman"/>
-        </w:rPr>
-        <w:t>The rapid growth of digital financial services has created a demand for intelligent systems capable of assisting individuals in understanding and managing their personal finances. Traditional financial advisory tools and robo-advisors often rely on static algorithms and limited personalization. This project proposes Prognosis AI, a web-based financial planning and robo-advisory platform that leverages a Multi-Agent System (MAS) combined with artificial intelligence techniques to provide personalized financial insights.</w:t>
-      </w:r>
-    </w:p>
-    <w:p>
-      <w:pPr>
-        <w:pStyle w:val="Normal"/>
-        <w:spacing w:lineRule="auto" w:line="276"/>
-        <w:rPr>
-          <w:rFonts w:ascii="Times New Roman" w:hAnsi="Times New Roman" w:cs="Times New Roman"/>
-        </w:rPr>
-      </w:pPr>
-      <w:r>
-        <w:rPr>
-          <w:rFonts w:cs="Times New Roman" w:ascii="Times New Roman" w:hAnsi="Times New Roman"/>
-        </w:rPr>
-        <w:t>The system integrates multiple intelligent agents responsible for evaluating different aspects of a user's financial state. A Risk Agent evaluates financial stability by analyzing transaction history, burn rate, and liquidity runway. A Goal Feasibility Agent assesses whether financial goals are achievable based on current savings and expected growth. An Investment Agent generates asset allocation strategies based on user risk capacity, risk appetite, and macroeconomic conditions. These analytical outputs are synthesized through a Narrator module powered by a Large Language Model that converts technical financial insights into human-readable reports.</w:t>
-      </w:r>
-    </w:p>
-    <w:p>
-      <w:pPr>
-        <w:pStyle w:val="Normal"/>
-        <w:spacing w:lineRule="auto" w:line="276"/>
-        <w:rPr>
-          <w:rFonts w:ascii="Times New Roman" w:hAnsi="Times New Roman" w:cs="Times New Roman"/>
-        </w:rPr>
-      </w:pPr>
-      <w:r>
-        <w:rPr>
-          <w:rFonts w:cs="Times New Roman" w:ascii="Times New Roman" w:hAnsi="Times New Roman"/>
-        </w:rPr>
-        <w:t>The platform is implemented as a full-stack web application using React for the frontend, FastAPI for backend services, and Supabase for database management and authentication. Financial data is collected through manually logged transactions and accounts to ensure user privacy and control over sensitive information.</w:t>
-      </w:r>
-    </w:p>
-    <w:p>
-      <w:pPr>
-        <w:pStyle w:val="Normal"/>
-        <w:spacing w:lineRule="auto" w:line="276"/>
-        <w:rPr>
-          <w:rFonts w:ascii="Times New Roman" w:hAnsi="Times New Roman" w:cs="Times New Roman"/>
-        </w:rPr>
-      </w:pPr>
-      <w:r>
-        <w:rPr>
-          <w:rFonts w:cs="Times New Roman" w:ascii="Times New Roman" w:hAnsi="Times New Roman"/>
-        </w:rPr>
-        <w:t>Experimental evaluation using synthetic and Kaggle-based financial datasets demonstrates that the system can efficiently generate financial reports within a few seconds while providing meaningful insights into financial health, goal feasibility, and asset allocation strategies.</w:t>
-      </w:r>
-    </w:p>
-    <w:p>
-      <w:pPr>
-        <w:pStyle w:val="Normal"/>
-        <w:spacing w:lineRule="auto" w:line="276"/>
-        <w:rPr>
-          <w:rFonts w:ascii="Times New Roman" w:hAnsi="Times New Roman" w:cs="Times New Roman"/>
-        </w:rPr>
-      </w:pPr>
-      <w:r>
-        <w:rPr>
-          <w:rFonts w:cs="Times New Roman" w:ascii="Times New Roman" w:hAnsi="Times New Roman"/>
-        </w:rPr>
-      </w:r>
-    </w:p>
-    <w:p>
-      <w:pPr>
-        <w:pStyle w:val="Normal"/>
-        <w:spacing w:lineRule="auto" w:line="276"/>
-        <w:rPr>
-          <w:rFonts w:ascii="Times New Roman" w:hAnsi="Times New Roman" w:cs="Times New Roman"/>
-        </w:rPr>
-      </w:pPr>
-      <w:r>
-        <w:rPr>
-          <w:rFonts w:cs="Times New Roman" w:ascii="Times New Roman" w:hAnsi="Times New Roman"/>
-        </w:rPr>
-      </w:r>
-    </w:p>
-    <w:p>
-      <w:pPr>
-        <w:pStyle w:val="Normal"/>
-        <w:spacing w:lineRule="auto" w:line="276"/>
-        <w:rPr>
-          <w:rFonts w:ascii="Times New Roman" w:hAnsi="Times New Roman" w:cs="Times New Roman"/>
-        </w:rPr>
-      </w:pPr>
-      <w:r>
-        <w:rPr>
-          <w:rFonts w:cs="Times New Roman" w:ascii="Times New Roman" w:hAnsi="Times New Roman"/>
-        </w:rPr>
-      </w:r>
-    </w:p>
-    <w:p>
-      <w:pPr>
-        <w:pStyle w:val="Normal"/>
-        <w:spacing w:lineRule="auto" w:line="276"/>
-        <w:rPr>
-          <w:rFonts w:ascii="Times New Roman" w:hAnsi="Times New Roman" w:cs="Times New Roman"/>
-        </w:rPr>
-      </w:pPr>
-      <w:r>
-        <w:rPr>
-          <w:rFonts w:cs="Times New Roman" w:ascii="Times New Roman" w:hAnsi="Times New Roman"/>
-        </w:rPr>
-      </w:r>
-    </w:p>
-    <w:p>
-      <w:pPr>
-        <w:pStyle w:val="Normal"/>
-        <w:rPr>
-          <w:rFonts w:ascii="Times New Roman" w:hAnsi="Times New Roman" w:cs="Times New Roman"/>
-          <w:b/>
-          <w:bCs/>
-        </w:rPr>
-      </w:pPr>
-      <w:r>
-        <w:rPr>
-          <w:rFonts w:cs="Times New Roman" w:ascii="Times New Roman" w:hAnsi="Times New Roman"/>
-          <w:b/>
-          <w:bCs/>
-        </w:rPr>
-        <w:t>Key words: </w:t>
-      </w:r>
-      <w:r>
-        <w:rPr>
-          <w:rFonts w:cs="Times New Roman" w:ascii="Times New Roman" w:hAnsi="Times New Roman"/>
-        </w:rPr>
-        <w:t>Artificial Intelligence in Finance, Personalized Financial Planning, Reinforcement Learning, Deep Q-Learning, Multi-Agent Systems, Financial Decision Support </w:t>
-      </w:r>
-    </w:p>
-    <w:p>
-      <w:pPr>
-        <w:pStyle w:val="Normal"/>
-        <w:rPr>
-          <w:rFonts w:ascii="Times New Roman" w:hAnsi="Times New Roman" w:cs="Times New Roman"/>
-          <w:b/>
-          <w:bCs/>
-        </w:rPr>
-      </w:pPr>
-      <w:r>
-        <w:rPr>
-          <w:rFonts w:cs="Times New Roman" w:ascii="Times New Roman" w:hAnsi="Times New Roman"/>
-          <w:b/>
-          <w:bCs/>
-        </w:rPr>
-        <w:t>  </w:t>
-      </w:r>
-    </w:p>
-    <w:p>
-      <w:pPr>
-        <w:pStyle w:val="Normal"/>
-        <w:rPr>
-          <w:rFonts w:ascii="Times New Roman" w:hAnsi="Times New Roman" w:cs="Times New Roman"/>
-          <w:b/>
-          <w:bCs/>
-        </w:rPr>
-      </w:pPr>
-      <w:r>
-        <w:rPr>
-          <w:rFonts w:cs="Times New Roman" w:ascii="Times New Roman" w:hAnsi="Times New Roman"/>
-          <w:b/>
-          <w:bCs/>
-        </w:rPr>
-        <w:t> </w:t>
-      </w:r>
-    </w:p>
-    <w:p>
-      <w:pPr>
-        <w:pStyle w:val="Normal"/>
-        <w:rPr>
-          <w:rFonts w:ascii="Times New Roman" w:hAnsi="Times New Roman" w:cs="Times New Roman"/>
-          <w:b/>
-          <w:bCs/>
-        </w:rPr>
-      </w:pPr>
-      <w:r>
-        <w:rPr>
-          <w:rFonts w:cs="Times New Roman" w:ascii="Times New Roman" w:hAnsi="Times New Roman"/>
-          <w:b/>
-          <w:bCs/>
-        </w:rPr>
-        <w:t> </w:t>
-      </w:r>
-    </w:p>
-    <w:p>
-      <w:pPr>
-        <w:pStyle w:val="Normal"/>
-        <w:rPr>
-          <w:rFonts w:ascii="Times New Roman" w:hAnsi="Times New Roman" w:cs="Times New Roman"/>
-          <w:b/>
-          <w:bCs/>
-        </w:rPr>
-      </w:pPr>
-      <w:r>
-        <w:rPr>
-          <w:rFonts w:cs="Times New Roman" w:ascii="Times New Roman" w:hAnsi="Times New Roman"/>
-          <w:b/>
-          <w:bCs/>
-        </w:rPr>
-        <w:t> </w:t>
-      </w:r>
-    </w:p>
-    <w:p>
-      <w:pPr>
-        <w:pStyle w:val="Normal"/>
-        <w:rPr>
-          <w:rFonts w:ascii="Times New Roman" w:hAnsi="Times New Roman" w:cs="Times New Roman"/>
-          <w:b/>
-          <w:bCs/>
-        </w:rPr>
-      </w:pPr>
-      <w:r>
-        <w:rPr>
-          <w:rFonts w:cs="Times New Roman" w:ascii="Times New Roman" w:hAnsi="Times New Roman"/>
-          <w:b/>
-          <w:bCs/>
-        </w:rPr>
-        <w:t> </w:t>
-      </w:r>
-    </w:p>
-    <w:p>
-      <w:pPr>
-        <w:pStyle w:val="Normal"/>
-        <w:rPr>
-          <w:rFonts w:ascii="Times New Roman" w:hAnsi="Times New Roman" w:cs="Times New Roman"/>
-          <w:b/>
-          <w:bCs/>
-        </w:rPr>
-      </w:pPr>
-      <w:r>
-        <w:rPr>
-          <w:rFonts w:cs="Times New Roman" w:ascii="Times New Roman" w:hAnsi="Times New Roman"/>
-          <w:b/>
-          <w:bCs/>
-        </w:rPr>
-      </w:r>
-    </w:p>
-    <w:p>
-      <w:pPr>
-        <w:pStyle w:val="Normal"/>
-        <w:rPr>
-          <w:rFonts w:ascii="Times New Roman" w:hAnsi="Times New Roman" w:cs="Times New Roman"/>
-          <w:b/>
-          <w:bCs/>
-        </w:rPr>
-      </w:pPr>
-      <w:r>
-        <w:rPr>
-          <w:rFonts w:cs="Times New Roman" w:ascii="Times New Roman" w:hAnsi="Times New Roman"/>
-          <w:b/>
-          <w:bCs/>
-        </w:rPr>
-        <w:t> </w:t>
-      </w:r>
-    </w:p>
-    <w:p>
-      <w:pPr>
-        <w:pStyle w:val="Normal"/>
-        <w:rPr>
-          <w:rFonts w:ascii="Times New Roman" w:hAnsi="Times New Roman" w:cs="Times New Roman"/>
-          <w:b/>
-          <w:bCs/>
-        </w:rPr>
-      </w:pPr>
-      <w:r>
-        <w:rPr>
-          <w:rFonts w:cs="Times New Roman" w:ascii="Times New Roman" w:hAnsi="Times New Roman"/>
-          <w:b/>
-          <w:bCs/>
+          <w:sz w:val="28"/>
+          <w:szCs w:val="28"/>
         </w:rPr>
       </w:r>
     </w:p>
@@ -343,8 +61,8 @@
         </w:tblCellMar>
       </w:tblPr>
       <w:tblGrid>
-        <w:gridCol w:w="1392"/>
-        <w:gridCol w:w="6430"/>
+        <w:gridCol w:w="1389"/>
+        <w:gridCol w:w="6433"/>
         <w:gridCol w:w="1796"/>
       </w:tblGrid>
       <w:tr>
@@ -353,7 +71,7 @@
         </w:trPr>
         <w:tc>
           <w:tcPr>
-            <w:tcW w:w="1392" w:type="dxa"/>
+            <w:tcW w:w="1389" w:type="dxa"/>
             <w:tcBorders>
               <w:top w:val="single" w:sz="6" w:space="0" w:color="000000"/>
               <w:left w:val="single" w:sz="6" w:space="0" w:color="000000"/>
@@ -384,7 +102,7 @@
         </w:tc>
         <w:tc>
           <w:tcPr>
-            <w:tcW w:w="6430" w:type="dxa"/>
+            <w:tcW w:w="6433" w:type="dxa"/>
             <w:tcBorders>
               <w:top w:val="single" w:sz="6" w:space="0" w:color="000000"/>
               <w:left w:val="single" w:sz="6" w:space="0" w:color="000000"/>
@@ -451,7 +169,7 @@
         </w:trPr>
         <w:tc>
           <w:tcPr>
-            <w:tcW w:w="1392" w:type="dxa"/>
+            <w:tcW w:w="1389" w:type="dxa"/>
             <w:tcBorders>
               <w:top w:val="single" w:sz="6" w:space="0" w:color="000000"/>
               <w:left w:val="single" w:sz="6" w:space="0" w:color="000000"/>
@@ -478,7 +196,7 @@
         </w:tc>
         <w:tc>
           <w:tcPr>
-            <w:tcW w:w="6430" w:type="dxa"/>
+            <w:tcW w:w="6433" w:type="dxa"/>
             <w:tcBorders>
               <w:top w:val="single" w:sz="6" w:space="0" w:color="000000"/>
               <w:left w:val="single" w:sz="6" w:space="0" w:color="000000"/>
@@ -548,7 +266,7 @@
         </w:trPr>
         <w:tc>
           <w:tcPr>
-            <w:tcW w:w="1392" w:type="dxa"/>
+            <w:tcW w:w="1389" w:type="dxa"/>
             <w:tcBorders>
               <w:top w:val="single" w:sz="6" w:space="0" w:color="000000"/>
               <w:left w:val="single" w:sz="6" w:space="0" w:color="000000"/>
@@ -574,7 +292,7 @@
         </w:tc>
         <w:tc>
           <w:tcPr>
-            <w:tcW w:w="6430" w:type="dxa"/>
+            <w:tcW w:w="6433" w:type="dxa"/>
             <w:tcBorders>
               <w:top w:val="single" w:sz="6" w:space="0" w:color="000000"/>
               <w:left w:val="single" w:sz="6" w:space="0" w:color="000000"/>
@@ -637,7 +355,7 @@
         </w:trPr>
         <w:tc>
           <w:tcPr>
-            <w:tcW w:w="1392" w:type="dxa"/>
+            <w:tcW w:w="1389" w:type="dxa"/>
             <w:tcBorders>
               <w:top w:val="single" w:sz="6" w:space="0" w:color="000000"/>
               <w:left w:val="single" w:sz="6" w:space="0" w:color="000000"/>
@@ -663,7 +381,7 @@
         </w:tc>
         <w:tc>
           <w:tcPr>
-            <w:tcW w:w="6430" w:type="dxa"/>
+            <w:tcW w:w="6433" w:type="dxa"/>
             <w:tcBorders>
               <w:top w:val="single" w:sz="6" w:space="0" w:color="000000"/>
               <w:left w:val="single" w:sz="6" w:space="0" w:color="000000"/>
@@ -720,7 +438,7 @@
         </w:trPr>
         <w:tc>
           <w:tcPr>
-            <w:tcW w:w="1392" w:type="dxa"/>
+            <w:tcW w:w="1389" w:type="dxa"/>
             <w:tcBorders>
               <w:left w:val="single" w:sz="6" w:space="0" w:color="000000"/>
               <w:bottom w:val="single" w:sz="6" w:space="0" w:color="000000"/>
@@ -745,7 +463,7 @@
         </w:tc>
         <w:tc>
           <w:tcPr>
-            <w:tcW w:w="6430" w:type="dxa"/>
+            <w:tcW w:w="6433" w:type="dxa"/>
             <w:tcBorders>
               <w:left w:val="single" w:sz="6" w:space="0" w:color="000000"/>
               <w:bottom w:val="single" w:sz="6" w:space="0" w:color="000000"/>
@@ -764,7 +482,7 @@
               <w:rPr>
                 <w:rFonts w:cs="Times New Roman" w:ascii="Times New Roman" w:hAnsi="Times New Roman"/>
               </w:rPr>
-              <w:t xml:space="preserve">1.3 </w:t>
+              <w:t>1.3</w:t>
             </w:r>
           </w:p>
         </w:tc>
@@ -800,7 +518,7 @@
         </w:trPr>
         <w:tc>
           <w:tcPr>
-            <w:tcW w:w="1392" w:type="dxa"/>
+            <w:tcW w:w="1389" w:type="dxa"/>
             <w:tcBorders>
               <w:left w:val="single" w:sz="6" w:space="0" w:color="000000"/>
               <w:bottom w:val="single" w:sz="6" w:space="0" w:color="000000"/>
@@ -825,7 +543,7 @@
         </w:tc>
         <w:tc>
           <w:tcPr>
-            <w:tcW w:w="6430" w:type="dxa"/>
+            <w:tcW w:w="6433" w:type="dxa"/>
             <w:tcBorders>
               <w:left w:val="single" w:sz="6" w:space="0" w:color="000000"/>
               <w:bottom w:val="single" w:sz="6" w:space="0" w:color="000000"/>
@@ -879,7 +597,7 @@
         </w:trPr>
         <w:tc>
           <w:tcPr>
-            <w:tcW w:w="1392" w:type="dxa"/>
+            <w:tcW w:w="1389" w:type="dxa"/>
             <w:tcBorders>
               <w:top w:val="single" w:sz="6" w:space="0" w:color="000000"/>
               <w:left w:val="single" w:sz="6" w:space="0" w:color="000000"/>
@@ -906,7 +624,7 @@
         </w:tc>
         <w:tc>
           <w:tcPr>
-            <w:tcW w:w="6430" w:type="dxa"/>
+            <w:tcW w:w="6433" w:type="dxa"/>
             <w:tcBorders>
               <w:top w:val="single" w:sz="6" w:space="0" w:color="000000"/>
               <w:left w:val="single" w:sz="6" w:space="0" w:color="000000"/>
@@ -976,7 +694,7 @@
         </w:trPr>
         <w:tc>
           <w:tcPr>
-            <w:tcW w:w="1392" w:type="dxa"/>
+            <w:tcW w:w="1389" w:type="dxa"/>
             <w:tcBorders>
               <w:top w:val="single" w:sz="6" w:space="0" w:color="000000"/>
               <w:left w:val="single" w:sz="6" w:space="0" w:color="000000"/>
@@ -1003,7 +721,7 @@
         </w:tc>
         <w:tc>
           <w:tcPr>
-            <w:tcW w:w="6430" w:type="dxa"/>
+            <w:tcW w:w="6433" w:type="dxa"/>
             <w:tcBorders>
               <w:top w:val="single" w:sz="6" w:space="0" w:color="000000"/>
               <w:left w:val="single" w:sz="6" w:space="0" w:color="000000"/>
@@ -1073,7 +791,7 @@
         </w:trPr>
         <w:tc>
           <w:tcPr>
-            <w:tcW w:w="1392" w:type="dxa"/>
+            <w:tcW w:w="1389" w:type="dxa"/>
             <w:tcBorders>
               <w:top w:val="single" w:sz="6" w:space="0" w:color="000000"/>
               <w:left w:val="single" w:sz="6" w:space="0" w:color="000000"/>
@@ -1100,7 +818,7 @@
         </w:tc>
         <w:tc>
           <w:tcPr>
-            <w:tcW w:w="6430" w:type="dxa"/>
+            <w:tcW w:w="6433" w:type="dxa"/>
             <w:tcBorders>
               <w:top w:val="single" w:sz="6" w:space="0" w:color="000000"/>
               <w:left w:val="single" w:sz="6" w:space="0" w:color="000000"/>
@@ -1170,7 +888,7 @@
         </w:trPr>
         <w:tc>
           <w:tcPr>
-            <w:tcW w:w="1392" w:type="dxa"/>
+            <w:tcW w:w="1389" w:type="dxa"/>
             <w:tcBorders>
               <w:top w:val="single" w:sz="6" w:space="0" w:color="000000"/>
               <w:left w:val="single" w:sz="6" w:space="0" w:color="000000"/>
@@ -1197,7 +915,7 @@
         </w:tc>
         <w:tc>
           <w:tcPr>
-            <w:tcW w:w="6430" w:type="dxa"/>
+            <w:tcW w:w="6433" w:type="dxa"/>
             <w:tcBorders>
               <w:top w:val="single" w:sz="6" w:space="0" w:color="000000"/>
               <w:left w:val="single" w:sz="6" w:space="0" w:color="000000"/>
@@ -1267,7 +985,7 @@
         </w:trPr>
         <w:tc>
           <w:tcPr>
-            <w:tcW w:w="1392" w:type="dxa"/>
+            <w:tcW w:w="1389" w:type="dxa"/>
             <w:tcBorders>
               <w:top w:val="single" w:sz="6" w:space="0" w:color="000000"/>
               <w:left w:val="single" w:sz="6" w:space="0" w:color="000000"/>
@@ -1294,7 +1012,7 @@
         </w:tc>
         <w:tc>
           <w:tcPr>
-            <w:tcW w:w="6430" w:type="dxa"/>
+            <w:tcW w:w="6433" w:type="dxa"/>
             <w:tcBorders>
               <w:top w:val="single" w:sz="6" w:space="0" w:color="000000"/>
               <w:left w:val="single" w:sz="6" w:space="0" w:color="000000"/>
@@ -1383,7 +1101,7 @@
         </w:trPr>
         <w:tc>
           <w:tcPr>
-            <w:tcW w:w="1392" w:type="dxa"/>
+            <w:tcW w:w="1389" w:type="dxa"/>
             <w:tcBorders>
               <w:top w:val="single" w:sz="6" w:space="0" w:color="000000"/>
               <w:left w:val="single" w:sz="6" w:space="0" w:color="000000"/>
@@ -1425,7 +1143,7 @@
         </w:tc>
         <w:tc>
           <w:tcPr>
-            <w:tcW w:w="6430" w:type="dxa"/>
+            <w:tcW w:w="6433" w:type="dxa"/>
             <w:tcBorders>
               <w:top w:val="single" w:sz="6" w:space="0" w:color="000000"/>
               <w:left w:val="single" w:sz="6" w:space="0" w:color="000000"/>
@@ -1495,7 +1213,7 @@
         </w:trPr>
         <w:tc>
           <w:tcPr>
-            <w:tcW w:w="1392" w:type="dxa"/>
+            <w:tcW w:w="1389" w:type="dxa"/>
             <w:tcBorders>
               <w:top w:val="single" w:sz="6" w:space="0" w:color="000000"/>
               <w:left w:val="single" w:sz="6" w:space="0" w:color="000000"/>
@@ -1537,7 +1255,7 @@
         </w:tc>
         <w:tc>
           <w:tcPr>
-            <w:tcW w:w="6430" w:type="dxa"/>
+            <w:tcW w:w="6433" w:type="dxa"/>
             <w:tcBorders>
               <w:top w:val="single" w:sz="6" w:space="0" w:color="000000"/>
               <w:left w:val="single" w:sz="6" w:space="0" w:color="000000"/>
@@ -1622,7 +1340,7 @@
         </w:trPr>
         <w:tc>
           <w:tcPr>
-            <w:tcW w:w="1392" w:type="dxa"/>
+            <w:tcW w:w="1389" w:type="dxa"/>
             <w:tcBorders>
               <w:top w:val="single" w:sz="6" w:space="0" w:color="000000"/>
               <w:left w:val="single" w:sz="6" w:space="0" w:color="000000"/>
@@ -1664,7 +1382,7 @@
         </w:tc>
         <w:tc>
           <w:tcPr>
-            <w:tcW w:w="6430" w:type="dxa"/>
+            <w:tcW w:w="6433" w:type="dxa"/>
             <w:tcBorders>
               <w:top w:val="single" w:sz="6" w:space="0" w:color="000000"/>
               <w:left w:val="single" w:sz="6" w:space="0" w:color="000000"/>
@@ -1749,7 +1467,7 @@
         </w:trPr>
         <w:tc>
           <w:tcPr>
-            <w:tcW w:w="1392" w:type="dxa"/>
+            <w:tcW w:w="1389" w:type="dxa"/>
             <w:tcBorders>
               <w:top w:val="single" w:sz="6" w:space="0" w:color="000000"/>
               <w:left w:val="single" w:sz="6" w:space="0" w:color="000000"/>
@@ -1776,7 +1494,7 @@
         </w:tc>
         <w:tc>
           <w:tcPr>
-            <w:tcW w:w="6430" w:type="dxa"/>
+            <w:tcW w:w="6433" w:type="dxa"/>
             <w:tcBorders>
               <w:top w:val="single" w:sz="6" w:space="0" w:color="000000"/>
               <w:left w:val="single" w:sz="6" w:space="0" w:color="000000"/>
@@ -2039,8 +1757,8 @@
       </w:tblPr>
       <w:tblGrid>
         <w:gridCol w:w="2136"/>
-        <w:gridCol w:w="6262"/>
-        <w:gridCol w:w="1298"/>
+        <w:gridCol w:w="6259"/>
+        <w:gridCol w:w="1301"/>
       </w:tblGrid>
       <w:tr>
         <w:trPr>
@@ -2079,7 +1797,7 @@
         </w:tc>
         <w:tc>
           <w:tcPr>
-            <w:tcW w:w="6262" w:type="dxa"/>
+            <w:tcW w:w="6259" w:type="dxa"/>
             <w:tcBorders>
               <w:top w:val="single" w:sz="6" w:space="0" w:color="000000"/>
               <w:left w:val="single" w:sz="6" w:space="0" w:color="000000"/>
@@ -2110,7 +1828,7 @@
         </w:tc>
         <w:tc>
           <w:tcPr>
-            <w:tcW w:w="1298" w:type="dxa"/>
+            <w:tcW w:w="1301" w:type="dxa"/>
             <w:tcBorders>
               <w:top w:val="single" w:sz="6" w:space="0" w:color="000000"/>
               <w:left w:val="single" w:sz="6" w:space="0" w:color="000000"/>
@@ -2173,7 +1891,7 @@
         </w:tc>
         <w:tc>
           <w:tcPr>
-            <w:tcW w:w="6262" w:type="dxa"/>
+            <w:tcW w:w="6259" w:type="dxa"/>
             <w:tcBorders>
               <w:top w:val="single" w:sz="6" w:space="0" w:color="000000"/>
               <w:left w:val="single" w:sz="6" w:space="0" w:color="000000"/>
@@ -2190,13 +1908,15 @@
               </w:rPr>
             </w:pPr>
             <w:r>
-              <w:rPr/>
+              <w:rPr>
+                <w:rFonts w:cs="Times New Roman" w:ascii="Times New Roman" w:hAnsi="Times New Roman"/>
+              </w:rPr>
             </w:r>
           </w:p>
         </w:tc>
         <w:tc>
           <w:tcPr>
-            <w:tcW w:w="1298" w:type="dxa"/>
+            <w:tcW w:w="1301" w:type="dxa"/>
             <w:tcBorders>
               <w:top w:val="single" w:sz="6" w:space="0" w:color="000000"/>
               <w:left w:val="single" w:sz="6" w:space="0" w:color="000000"/>
@@ -2255,7 +1975,7 @@
         </w:tc>
         <w:tc>
           <w:tcPr>
-            <w:tcW w:w="6262" w:type="dxa"/>
+            <w:tcW w:w="6259" w:type="dxa"/>
             <w:tcBorders>
               <w:top w:val="single" w:sz="6" w:space="0" w:color="000000"/>
               <w:left w:val="single" w:sz="6" w:space="0" w:color="000000"/>
@@ -2287,7 +2007,7 @@
         </w:tc>
         <w:tc>
           <w:tcPr>
-            <w:tcW w:w="1298" w:type="dxa"/>
+            <w:tcW w:w="1301" w:type="dxa"/>
             <w:tcBorders>
               <w:top w:val="single" w:sz="6" w:space="0" w:color="000000"/>
               <w:left w:val="single" w:sz="6" w:space="0" w:color="000000"/>
@@ -2346,7 +2066,7 @@
         </w:tc>
         <w:tc>
           <w:tcPr>
-            <w:tcW w:w="6262" w:type="dxa"/>
+            <w:tcW w:w="6259" w:type="dxa"/>
             <w:tcBorders>
               <w:top w:val="single" w:sz="6" w:space="0" w:color="000000"/>
               <w:left w:val="single" w:sz="6" w:space="0" w:color="000000"/>
@@ -2378,7 +2098,7 @@
         </w:tc>
         <w:tc>
           <w:tcPr>
-            <w:tcW w:w="1298" w:type="dxa"/>
+            <w:tcW w:w="1301" w:type="dxa"/>
             <w:tcBorders>
               <w:top w:val="single" w:sz="6" w:space="0" w:color="000000"/>
               <w:left w:val="single" w:sz="6" w:space="0" w:color="000000"/>
@@ -2437,7 +2157,7 @@
         </w:tc>
         <w:tc>
           <w:tcPr>
-            <w:tcW w:w="6262" w:type="dxa"/>
+            <w:tcW w:w="6259" w:type="dxa"/>
             <w:tcBorders>
               <w:top w:val="single" w:sz="6" w:space="0" w:color="000000"/>
               <w:left w:val="single" w:sz="6" w:space="0" w:color="000000"/>
@@ -2469,7 +2189,7 @@
         </w:tc>
         <w:tc>
           <w:tcPr>
-            <w:tcW w:w="1298" w:type="dxa"/>
+            <w:tcW w:w="1301" w:type="dxa"/>
             <w:tcBorders>
               <w:top w:val="single" w:sz="6" w:space="0" w:color="000000"/>
               <w:left w:val="single" w:sz="6" w:space="0" w:color="000000"/>
@@ -2528,7 +2248,7 @@
         </w:tc>
         <w:tc>
           <w:tcPr>
-            <w:tcW w:w="6262" w:type="dxa"/>
+            <w:tcW w:w="6259" w:type="dxa"/>
             <w:tcBorders>
               <w:top w:val="single" w:sz="6" w:space="0" w:color="000000"/>
               <w:left w:val="single" w:sz="6" w:space="0" w:color="000000"/>
@@ -2560,7 +2280,7 @@
         </w:tc>
         <w:tc>
           <w:tcPr>
-            <w:tcW w:w="1298" w:type="dxa"/>
+            <w:tcW w:w="1301" w:type="dxa"/>
             <w:tcBorders>
               <w:top w:val="single" w:sz="6" w:space="0" w:color="000000"/>
               <w:left w:val="single" w:sz="6" w:space="0" w:color="000000"/>
@@ -2619,7 +2339,7 @@
         </w:tc>
         <w:tc>
           <w:tcPr>
-            <w:tcW w:w="6262" w:type="dxa"/>
+            <w:tcW w:w="6259" w:type="dxa"/>
             <w:tcBorders>
               <w:top w:val="single" w:sz="6" w:space="0" w:color="000000"/>
               <w:left w:val="single" w:sz="6" w:space="0" w:color="000000"/>
@@ -2651,7 +2371,7 @@
         </w:tc>
         <w:tc>
           <w:tcPr>
-            <w:tcW w:w="1298" w:type="dxa"/>
+            <w:tcW w:w="1301" w:type="dxa"/>
             <w:tcBorders>
               <w:top w:val="single" w:sz="6" w:space="0" w:color="000000"/>
               <w:left w:val="single" w:sz="6" w:space="0" w:color="000000"/>
@@ -2710,7 +2430,7 @@
         </w:tc>
         <w:tc>
           <w:tcPr>
-            <w:tcW w:w="6262" w:type="dxa"/>
+            <w:tcW w:w="6259" w:type="dxa"/>
             <w:tcBorders>
               <w:top w:val="single" w:sz="6" w:space="0" w:color="000000"/>
               <w:left w:val="single" w:sz="6" w:space="0" w:color="000000"/>
@@ -2742,7 +2462,7 @@
         </w:tc>
         <w:tc>
           <w:tcPr>
-            <w:tcW w:w="1298" w:type="dxa"/>
+            <w:tcW w:w="1301" w:type="dxa"/>
             <w:tcBorders>
               <w:top w:val="single" w:sz="6" w:space="0" w:color="000000"/>
               <w:left w:val="single" w:sz="6" w:space="0" w:color="000000"/>
@@ -2801,7 +2521,7 @@
         </w:tc>
         <w:tc>
           <w:tcPr>
-            <w:tcW w:w="6262" w:type="dxa"/>
+            <w:tcW w:w="6259" w:type="dxa"/>
             <w:tcBorders>
               <w:top w:val="single" w:sz="6" w:space="0" w:color="000000"/>
               <w:left w:val="single" w:sz="6" w:space="0" w:color="000000"/>
@@ -2833,7 +2553,7 @@
         </w:tc>
         <w:tc>
           <w:tcPr>
-            <w:tcW w:w="1298" w:type="dxa"/>
+            <w:tcW w:w="1301" w:type="dxa"/>
             <w:tcBorders>
               <w:top w:val="single" w:sz="6" w:space="0" w:color="000000"/>
               <w:left w:val="single" w:sz="6" w:space="0" w:color="000000"/>
@@ -9520,17 +9240,17 @@
         </w:tblCellMar>
       </w:tblPr>
       <w:tblGrid>
-        <w:gridCol w:w="1135"/>
-        <w:gridCol w:w="1735"/>
-        <w:gridCol w:w="1993"/>
-        <w:gridCol w:w="2357"/>
+        <w:gridCol w:w="1133"/>
+        <w:gridCol w:w="1734"/>
+        <w:gridCol w:w="1994"/>
+        <w:gridCol w:w="2359"/>
         <w:gridCol w:w="1844"/>
       </w:tblGrid>
       <w:tr>
         <w:trPr/>
         <w:tc>
           <w:tcPr>
-            <w:tcW w:w="1135" w:type="dxa"/>
+            <w:tcW w:w="1133" w:type="dxa"/>
             <w:tcBorders>
               <w:top w:val="single" w:sz="4" w:space="0" w:color="000000"/>
               <w:left w:val="single" w:sz="4" w:space="0" w:color="000000"/>
@@ -9563,7 +9283,7 @@
         </w:tc>
         <w:tc>
           <w:tcPr>
-            <w:tcW w:w="1735" w:type="dxa"/>
+            <w:tcW w:w="1734" w:type="dxa"/>
             <w:tcBorders>
               <w:top w:val="single" w:sz="4" w:space="0" w:color="000000"/>
               <w:left w:val="single" w:sz="4" w:space="0" w:color="000000"/>
@@ -9596,7 +9316,7 @@
         </w:tc>
         <w:tc>
           <w:tcPr>
-            <w:tcW w:w="1993" w:type="dxa"/>
+            <w:tcW w:w="1994" w:type="dxa"/>
             <w:tcBorders>
               <w:top w:val="single" w:sz="4" w:space="0" w:color="000000"/>
               <w:left w:val="single" w:sz="4" w:space="0" w:color="000000"/>
@@ -9629,7 +9349,7 @@
         </w:tc>
         <w:tc>
           <w:tcPr>
-            <w:tcW w:w="2357" w:type="dxa"/>
+            <w:tcW w:w="2359" w:type="dxa"/>
             <w:tcBorders>
               <w:top w:val="single" w:sz="4" w:space="0" w:color="000000"/>
               <w:left w:val="single" w:sz="4" w:space="0" w:color="000000"/>
@@ -9699,7 +9419,7 @@
         <w:trPr/>
         <w:tc>
           <w:tcPr>
-            <w:tcW w:w="1135" w:type="dxa"/>
+            <w:tcW w:w="1133" w:type="dxa"/>
             <w:tcBorders>
               <w:left w:val="single" w:sz="4" w:space="0" w:color="000000"/>
               <w:bottom w:val="single" w:sz="4" w:space="0" w:color="000000"/>
@@ -9737,7 +9457,7 @@
         </w:tc>
         <w:tc>
           <w:tcPr>
-            <w:tcW w:w="1735" w:type="dxa"/>
+            <w:tcW w:w="1734" w:type="dxa"/>
             <w:tcBorders>
               <w:left w:val="single" w:sz="4" w:space="0" w:color="000000"/>
               <w:bottom w:val="single" w:sz="4" w:space="0" w:color="000000"/>
@@ -9775,7 +9495,7 @@
         </w:tc>
         <w:tc>
           <w:tcPr>
-            <w:tcW w:w="1993" w:type="dxa"/>
+            <w:tcW w:w="1994" w:type="dxa"/>
             <w:tcBorders>
               <w:left w:val="single" w:sz="4" w:space="0" w:color="000000"/>
               <w:bottom w:val="single" w:sz="4" w:space="0" w:color="000000"/>
@@ -9813,7 +9533,7 @@
         </w:tc>
         <w:tc>
           <w:tcPr>
-            <w:tcW w:w="2357" w:type="dxa"/>
+            <w:tcW w:w="2359" w:type="dxa"/>
             <w:tcBorders>
               <w:left w:val="single" w:sz="4" w:space="0" w:color="000000"/>
               <w:bottom w:val="single" w:sz="4" w:space="0" w:color="000000"/>
@@ -9893,7 +9613,7 @@
         <w:trPr/>
         <w:tc>
           <w:tcPr>
-            <w:tcW w:w="1135" w:type="dxa"/>
+            <w:tcW w:w="1133" w:type="dxa"/>
             <w:tcBorders>
               <w:left w:val="single" w:sz="4" w:space="0" w:color="000000"/>
               <w:bottom w:val="single" w:sz="4" w:space="0" w:color="000000"/>
@@ -9931,7 +9651,7 @@
         </w:tc>
         <w:tc>
           <w:tcPr>
-            <w:tcW w:w="1735" w:type="dxa"/>
+            <w:tcW w:w="1734" w:type="dxa"/>
             <w:tcBorders>
               <w:left w:val="single" w:sz="4" w:space="0" w:color="000000"/>
               <w:bottom w:val="single" w:sz="4" w:space="0" w:color="000000"/>
@@ -9969,7 +9689,7 @@
         </w:tc>
         <w:tc>
           <w:tcPr>
-            <w:tcW w:w="1993" w:type="dxa"/>
+            <w:tcW w:w="1994" w:type="dxa"/>
             <w:tcBorders>
               <w:left w:val="single" w:sz="4" w:space="0" w:color="000000"/>
               <w:bottom w:val="single" w:sz="4" w:space="0" w:color="000000"/>
@@ -10007,7 +9727,7 @@
         </w:tc>
         <w:tc>
           <w:tcPr>
-            <w:tcW w:w="2357" w:type="dxa"/>
+            <w:tcW w:w="2359" w:type="dxa"/>
             <w:tcBorders>
               <w:left w:val="single" w:sz="4" w:space="0" w:color="000000"/>
               <w:bottom w:val="single" w:sz="4" w:space="0" w:color="000000"/>
@@ -10087,7 +9807,7 @@
         <w:trPr/>
         <w:tc>
           <w:tcPr>
-            <w:tcW w:w="1135" w:type="dxa"/>
+            <w:tcW w:w="1133" w:type="dxa"/>
             <w:tcBorders>
               <w:left w:val="single" w:sz="4" w:space="0" w:color="000000"/>
               <w:bottom w:val="single" w:sz="4" w:space="0" w:color="000000"/>
@@ -10125,7 +9845,7 @@
         </w:tc>
         <w:tc>
           <w:tcPr>
-            <w:tcW w:w="1735" w:type="dxa"/>
+            <w:tcW w:w="1734" w:type="dxa"/>
             <w:tcBorders>
               <w:left w:val="single" w:sz="4" w:space="0" w:color="000000"/>
               <w:bottom w:val="single" w:sz="4" w:space="0" w:color="000000"/>
@@ -10163,7 +9883,7 @@
         </w:tc>
         <w:tc>
           <w:tcPr>
-            <w:tcW w:w="1993" w:type="dxa"/>
+            <w:tcW w:w="1994" w:type="dxa"/>
             <w:tcBorders>
               <w:left w:val="single" w:sz="4" w:space="0" w:color="000000"/>
               <w:bottom w:val="single" w:sz="4" w:space="0" w:color="000000"/>
@@ -10201,7 +9921,7 @@
         </w:tc>
         <w:tc>
           <w:tcPr>
-            <w:tcW w:w="2357" w:type="dxa"/>
+            <w:tcW w:w="2359" w:type="dxa"/>
             <w:tcBorders>
               <w:left w:val="single" w:sz="4" w:space="0" w:color="000000"/>
               <w:bottom w:val="single" w:sz="4" w:space="0" w:color="000000"/>
@@ -10281,7 +10001,7 @@
         <w:trPr/>
         <w:tc>
           <w:tcPr>
-            <w:tcW w:w="1135" w:type="dxa"/>
+            <w:tcW w:w="1133" w:type="dxa"/>
             <w:tcBorders>
               <w:left w:val="single" w:sz="4" w:space="0" w:color="000000"/>
               <w:bottom w:val="single" w:sz="4" w:space="0" w:color="000000"/>
@@ -10319,7 +10039,7 @@
         </w:tc>
         <w:tc>
           <w:tcPr>
-            <w:tcW w:w="1735" w:type="dxa"/>
+            <w:tcW w:w="1734" w:type="dxa"/>
             <w:tcBorders>
               <w:left w:val="single" w:sz="4" w:space="0" w:color="000000"/>
               <w:bottom w:val="single" w:sz="4" w:space="0" w:color="000000"/>
@@ -10357,7 +10077,7 @@
         </w:tc>
         <w:tc>
           <w:tcPr>
-            <w:tcW w:w="1993" w:type="dxa"/>
+            <w:tcW w:w="1994" w:type="dxa"/>
             <w:tcBorders>
               <w:left w:val="single" w:sz="4" w:space="0" w:color="000000"/>
               <w:bottom w:val="single" w:sz="4" w:space="0" w:color="000000"/>
@@ -10395,7 +10115,7 @@
         </w:tc>
         <w:tc>
           <w:tcPr>
-            <w:tcW w:w="2357" w:type="dxa"/>
+            <w:tcW w:w="2359" w:type="dxa"/>
             <w:tcBorders>
               <w:left w:val="single" w:sz="4" w:space="0" w:color="000000"/>
               <w:bottom w:val="single" w:sz="4" w:space="0" w:color="000000"/>
@@ -10475,7 +10195,7 @@
         <w:trPr/>
         <w:tc>
           <w:tcPr>
-            <w:tcW w:w="1135" w:type="dxa"/>
+            <w:tcW w:w="1133" w:type="dxa"/>
             <w:tcBorders>
               <w:left w:val="single" w:sz="4" w:space="0" w:color="000000"/>
               <w:bottom w:val="single" w:sz="4" w:space="0" w:color="000000"/>
@@ -10513,7 +10233,7 @@
         </w:tc>
         <w:tc>
           <w:tcPr>
-            <w:tcW w:w="1735" w:type="dxa"/>
+            <w:tcW w:w="1734" w:type="dxa"/>
             <w:tcBorders>
               <w:left w:val="single" w:sz="4" w:space="0" w:color="000000"/>
               <w:bottom w:val="single" w:sz="4" w:space="0" w:color="000000"/>
@@ -10551,7 +10271,7 @@
         </w:tc>
         <w:tc>
           <w:tcPr>
-            <w:tcW w:w="1993" w:type="dxa"/>
+            <w:tcW w:w="1994" w:type="dxa"/>
             <w:tcBorders>
               <w:left w:val="single" w:sz="4" w:space="0" w:color="000000"/>
               <w:bottom w:val="single" w:sz="4" w:space="0" w:color="000000"/>
@@ -10589,7 +10309,7 @@
         </w:tc>
         <w:tc>
           <w:tcPr>
-            <w:tcW w:w="2357" w:type="dxa"/>
+            <w:tcW w:w="2359" w:type="dxa"/>
             <w:tcBorders>
               <w:left w:val="single" w:sz="4" w:space="0" w:color="000000"/>
               <w:bottom w:val="single" w:sz="4" w:space="0" w:color="000000"/>
@@ -10669,7 +10389,7 @@
         <w:trPr/>
         <w:tc>
           <w:tcPr>
-            <w:tcW w:w="1135" w:type="dxa"/>
+            <w:tcW w:w="1133" w:type="dxa"/>
             <w:tcBorders>
               <w:left w:val="single" w:sz="4" w:space="0" w:color="000000"/>
               <w:bottom w:val="single" w:sz="4" w:space="0" w:color="000000"/>
@@ -10707,7 +10427,7 @@
         </w:tc>
         <w:tc>
           <w:tcPr>
-            <w:tcW w:w="1735" w:type="dxa"/>
+            <w:tcW w:w="1734" w:type="dxa"/>
             <w:tcBorders>
               <w:left w:val="single" w:sz="4" w:space="0" w:color="000000"/>
               <w:bottom w:val="single" w:sz="4" w:space="0" w:color="000000"/>
@@ -10745,7 +10465,7 @@
         </w:tc>
         <w:tc>
           <w:tcPr>
-            <w:tcW w:w="1993" w:type="dxa"/>
+            <w:tcW w:w="1994" w:type="dxa"/>
             <w:tcBorders>
               <w:left w:val="single" w:sz="4" w:space="0" w:color="000000"/>
               <w:bottom w:val="single" w:sz="4" w:space="0" w:color="000000"/>
@@ -10783,7 +10503,7 @@
         </w:tc>
         <w:tc>
           <w:tcPr>
-            <w:tcW w:w="2357" w:type="dxa"/>
+            <w:tcW w:w="2359" w:type="dxa"/>
             <w:tcBorders>
               <w:left w:val="single" w:sz="4" w:space="0" w:color="000000"/>
               <w:bottom w:val="single" w:sz="4" w:space="0" w:color="000000"/>
@@ -10863,7 +10583,7 @@
         <w:trPr/>
         <w:tc>
           <w:tcPr>
-            <w:tcW w:w="1135" w:type="dxa"/>
+            <w:tcW w:w="1133" w:type="dxa"/>
             <w:tcBorders>
               <w:left w:val="single" w:sz="4" w:space="0" w:color="000000"/>
               <w:bottom w:val="single" w:sz="4" w:space="0" w:color="000000"/>
@@ -10901,7 +10621,7 @@
         </w:tc>
         <w:tc>
           <w:tcPr>
-            <w:tcW w:w="1735" w:type="dxa"/>
+            <w:tcW w:w="1734" w:type="dxa"/>
             <w:tcBorders>
               <w:left w:val="single" w:sz="4" w:space="0" w:color="000000"/>
               <w:bottom w:val="single" w:sz="4" w:space="0" w:color="000000"/>
@@ -10939,7 +10659,7 @@
         </w:tc>
         <w:tc>
           <w:tcPr>
-            <w:tcW w:w="1993" w:type="dxa"/>
+            <w:tcW w:w="1994" w:type="dxa"/>
             <w:tcBorders>
               <w:left w:val="single" w:sz="4" w:space="0" w:color="000000"/>
               <w:bottom w:val="single" w:sz="4" w:space="0" w:color="000000"/>
@@ -10977,7 +10697,7 @@
         </w:tc>
         <w:tc>
           <w:tcPr>
-            <w:tcW w:w="2357" w:type="dxa"/>
+            <w:tcW w:w="2359" w:type="dxa"/>
             <w:tcBorders>
               <w:left w:val="single" w:sz="4" w:space="0" w:color="000000"/>
               <w:bottom w:val="single" w:sz="4" w:space="0" w:color="000000"/>
@@ -11057,7 +10777,7 @@
         <w:trPr/>
         <w:tc>
           <w:tcPr>
-            <w:tcW w:w="1135" w:type="dxa"/>
+            <w:tcW w:w="1133" w:type="dxa"/>
             <w:tcBorders>
               <w:left w:val="single" w:sz="4" w:space="0" w:color="000000"/>
               <w:bottom w:val="single" w:sz="4" w:space="0" w:color="000000"/>
@@ -11095,7 +10815,7 @@
         </w:tc>
         <w:tc>
           <w:tcPr>
-            <w:tcW w:w="1735" w:type="dxa"/>
+            <w:tcW w:w="1734" w:type="dxa"/>
             <w:tcBorders>
               <w:left w:val="single" w:sz="4" w:space="0" w:color="000000"/>
               <w:bottom w:val="single" w:sz="4" w:space="0" w:color="000000"/>
@@ -11133,7 +10853,7 @@
         </w:tc>
         <w:tc>
           <w:tcPr>
-            <w:tcW w:w="1993" w:type="dxa"/>
+            <w:tcW w:w="1994" w:type="dxa"/>
             <w:tcBorders>
               <w:left w:val="single" w:sz="4" w:space="0" w:color="000000"/>
               <w:bottom w:val="single" w:sz="4" w:space="0" w:color="000000"/>
@@ -11171,7 +10891,7 @@
         </w:tc>
         <w:tc>
           <w:tcPr>
-            <w:tcW w:w="2357" w:type="dxa"/>
+            <w:tcW w:w="2359" w:type="dxa"/>
             <w:tcBorders>
               <w:left w:val="single" w:sz="4" w:space="0" w:color="000000"/>
               <w:bottom w:val="single" w:sz="4" w:space="0" w:color="000000"/>
@@ -11251,7 +10971,7 @@
         <w:trPr/>
         <w:tc>
           <w:tcPr>
-            <w:tcW w:w="1135" w:type="dxa"/>
+            <w:tcW w:w="1133" w:type="dxa"/>
             <w:tcBorders>
               <w:left w:val="single" w:sz="4" w:space="0" w:color="000000"/>
               <w:bottom w:val="single" w:sz="4" w:space="0" w:color="000000"/>
@@ -11289,7 +11009,7 @@
         </w:tc>
         <w:tc>
           <w:tcPr>
-            <w:tcW w:w="1735" w:type="dxa"/>
+            <w:tcW w:w="1734" w:type="dxa"/>
             <w:tcBorders>
               <w:left w:val="single" w:sz="4" w:space="0" w:color="000000"/>
               <w:bottom w:val="single" w:sz="4" w:space="0" w:color="000000"/>
@@ -11327,7 +11047,7 @@
         </w:tc>
         <w:tc>
           <w:tcPr>
-            <w:tcW w:w="1993" w:type="dxa"/>
+            <w:tcW w:w="1994" w:type="dxa"/>
             <w:tcBorders>
               <w:left w:val="single" w:sz="4" w:space="0" w:color="000000"/>
               <w:bottom w:val="single" w:sz="4" w:space="0" w:color="000000"/>
@@ -11365,7 +11085,7 @@
         </w:tc>
         <w:tc>
           <w:tcPr>
-            <w:tcW w:w="2357" w:type="dxa"/>
+            <w:tcW w:w="2359" w:type="dxa"/>
             <w:tcBorders>
               <w:left w:val="single" w:sz="4" w:space="0" w:color="000000"/>
               <w:bottom w:val="single" w:sz="4" w:space="0" w:color="000000"/>
@@ -11445,7 +11165,7 @@
         <w:trPr/>
         <w:tc>
           <w:tcPr>
-            <w:tcW w:w="1135" w:type="dxa"/>
+            <w:tcW w:w="1133" w:type="dxa"/>
             <w:tcBorders>
               <w:left w:val="single" w:sz="4" w:space="0" w:color="000000"/>
               <w:bottom w:val="single" w:sz="4" w:space="0" w:color="000000"/>
@@ -11483,7 +11203,7 @@
         </w:tc>
         <w:tc>
           <w:tcPr>
-            <w:tcW w:w="1735" w:type="dxa"/>
+            <w:tcW w:w="1734" w:type="dxa"/>
             <w:tcBorders>
               <w:left w:val="single" w:sz="4" w:space="0" w:color="000000"/>
               <w:bottom w:val="single" w:sz="4" w:space="0" w:color="000000"/>
@@ -11521,7 +11241,7 @@
         </w:tc>
         <w:tc>
           <w:tcPr>
-            <w:tcW w:w="1993" w:type="dxa"/>
+            <w:tcW w:w="1994" w:type="dxa"/>
             <w:tcBorders>
               <w:left w:val="single" w:sz="4" w:space="0" w:color="000000"/>
               <w:bottom w:val="single" w:sz="4" w:space="0" w:color="000000"/>
@@ -11559,7 +11279,7 @@
         </w:tc>
         <w:tc>
           <w:tcPr>
-            <w:tcW w:w="2357" w:type="dxa"/>
+            <w:tcW w:w="2359" w:type="dxa"/>
             <w:tcBorders>
               <w:left w:val="single" w:sz="4" w:space="0" w:color="000000"/>
               <w:bottom w:val="single" w:sz="4" w:space="0" w:color="000000"/>
@@ -11639,7 +11359,7 @@
         <w:trPr/>
         <w:tc>
           <w:tcPr>
-            <w:tcW w:w="1135" w:type="dxa"/>
+            <w:tcW w:w="1133" w:type="dxa"/>
             <w:tcBorders>
               <w:left w:val="single" w:sz="4" w:space="0" w:color="000000"/>
               <w:bottom w:val="single" w:sz="4" w:space="0" w:color="000000"/>
@@ -11677,7 +11397,7 @@
         </w:tc>
         <w:tc>
           <w:tcPr>
-            <w:tcW w:w="1735" w:type="dxa"/>
+            <w:tcW w:w="1734" w:type="dxa"/>
             <w:tcBorders>
               <w:left w:val="single" w:sz="4" w:space="0" w:color="000000"/>
               <w:bottom w:val="single" w:sz="4" w:space="0" w:color="000000"/>
@@ -11715,7 +11435,7 @@
         </w:tc>
         <w:tc>
           <w:tcPr>
-            <w:tcW w:w="1993" w:type="dxa"/>
+            <w:tcW w:w="1994" w:type="dxa"/>
             <w:tcBorders>
               <w:left w:val="single" w:sz="4" w:space="0" w:color="000000"/>
               <w:bottom w:val="single" w:sz="4" w:space="0" w:color="000000"/>
@@ -11753,7 +11473,7 @@
         </w:tc>
         <w:tc>
           <w:tcPr>
-            <w:tcW w:w="2357" w:type="dxa"/>
+            <w:tcW w:w="2359" w:type="dxa"/>
             <w:tcBorders>
               <w:left w:val="single" w:sz="4" w:space="0" w:color="000000"/>
               <w:bottom w:val="single" w:sz="4" w:space="0" w:color="000000"/>
@@ -11835,7 +11555,7 @@
         </w:trPr>
         <w:tc>
           <w:tcPr>
-            <w:tcW w:w="1135" w:type="dxa"/>
+            <w:tcW w:w="1133" w:type="dxa"/>
             <w:tcBorders>
               <w:left w:val="single" w:sz="4" w:space="0" w:color="000000"/>
               <w:bottom w:val="single" w:sz="4" w:space="0" w:color="000000"/>
@@ -11873,7 +11593,7 @@
         </w:tc>
         <w:tc>
           <w:tcPr>
-            <w:tcW w:w="1735" w:type="dxa"/>
+            <w:tcW w:w="1734" w:type="dxa"/>
             <w:tcBorders>
               <w:left w:val="single" w:sz="4" w:space="0" w:color="000000"/>
               <w:bottom w:val="single" w:sz="4" w:space="0" w:color="000000"/>
@@ -11911,7 +11631,7 @@
         </w:tc>
         <w:tc>
           <w:tcPr>
-            <w:tcW w:w="1993" w:type="dxa"/>
+            <w:tcW w:w="1994" w:type="dxa"/>
             <w:tcBorders>
               <w:left w:val="single" w:sz="4" w:space="0" w:color="000000"/>
               <w:bottom w:val="single" w:sz="4" w:space="0" w:color="000000"/>
@@ -11949,7 +11669,7 @@
         </w:tc>
         <w:tc>
           <w:tcPr>
-            <w:tcW w:w="2357" w:type="dxa"/>
+            <w:tcW w:w="2359" w:type="dxa"/>
             <w:tcBorders>
               <w:left w:val="single" w:sz="4" w:space="0" w:color="000000"/>
               <w:bottom w:val="single" w:sz="4" w:space="0" w:color="000000"/>
@@ -12031,7 +11751,7 @@
         </w:trPr>
         <w:tc>
           <w:tcPr>
-            <w:tcW w:w="1135" w:type="dxa"/>
+            <w:tcW w:w="1133" w:type="dxa"/>
             <w:tcBorders>
               <w:left w:val="single" w:sz="4" w:space="0" w:color="000000"/>
               <w:bottom w:val="single" w:sz="4" w:space="0" w:color="000000"/>
@@ -12069,7 +11789,7 @@
         </w:tc>
         <w:tc>
           <w:tcPr>
-            <w:tcW w:w="1735" w:type="dxa"/>
+            <w:tcW w:w="1734" w:type="dxa"/>
             <w:tcBorders>
               <w:left w:val="single" w:sz="4" w:space="0" w:color="000000"/>
               <w:bottom w:val="single" w:sz="4" w:space="0" w:color="000000"/>
@@ -12107,7 +11827,7 @@
         </w:tc>
         <w:tc>
           <w:tcPr>
-            <w:tcW w:w="1993" w:type="dxa"/>
+            <w:tcW w:w="1994" w:type="dxa"/>
             <w:tcBorders>
               <w:left w:val="single" w:sz="4" w:space="0" w:color="000000"/>
               <w:bottom w:val="single" w:sz="4" w:space="0" w:color="000000"/>
@@ -12145,7 +11865,7 @@
         </w:tc>
         <w:tc>
           <w:tcPr>
-            <w:tcW w:w="2357" w:type="dxa"/>
+            <w:tcW w:w="2359" w:type="dxa"/>
             <w:tcBorders>
               <w:left w:val="single" w:sz="4" w:space="0" w:color="000000"/>
               <w:bottom w:val="single" w:sz="4" w:space="0" w:color="000000"/>
@@ -26566,7 +26286,7 @@
         <w:pStyle w:val="BodyText"/>
         <w:widowControl/>
         <w:suppressAutoHyphens w:val="true"/>
-        <w:overflowPunct w:val="false"/>
+        <w:overflowPunct w:val="true"/>
         <w:bidi w:val="0"/>
         <w:spacing w:lineRule="auto" w:line="278" w:before="0" w:after="160"/>
         <w:jc w:val="left"/>
@@ -26612,7 +26332,7 @@
         <w:pStyle w:val="BodyText"/>
         <w:widowControl/>
         <w:suppressAutoHyphens w:val="true"/>
-        <w:overflowPunct w:val="false"/>
+        <w:overflowPunct w:val="true"/>
         <w:bidi w:val="0"/>
         <w:spacing w:lineRule="auto" w:line="278" w:before="0" w:after="160"/>
         <w:jc w:val="left"/>
@@ -26675,7 +26395,7 @@
           <w:tab w:val="left" w:pos="0" w:leader="none"/>
         </w:tabs>
         <w:suppressAutoHyphens w:val="true"/>
-        <w:overflowPunct w:val="false"/>
+        <w:overflowPunct w:val="true"/>
         <w:bidi w:val="0"/>
         <w:spacing w:lineRule="auto" w:line="278" w:before="0" w:after="160"/>
         <w:ind w:hanging="283" w:left="709"/>
@@ -26794,7 +26514,7 @@
         <w:pStyle w:val="BodyText"/>
         <w:widowControl/>
         <w:suppressAutoHyphens w:val="true"/>
-        <w:overflowPunct w:val="false"/>
+        <w:overflowPunct w:val="true"/>
         <w:bidi w:val="0"/>
         <w:spacing w:lineRule="auto" w:line="278" w:before="0" w:after="160"/>
         <w:jc w:val="left"/>
@@ -26824,9 +26544,10 @@
         <w:pStyle w:val="Heading3"/>
         <w:widowControl/>
         <w:suppressAutoHyphens w:val="true"/>
-        <w:overflowPunct w:val="false"/>
+        <w:overflowPunct w:val="true"/>
         <w:bidi w:val="0"/>
         <w:spacing w:lineRule="auto" w:line="278" w:before="0" w:after="160"/>
+        <w:ind w:hanging="0" w:left="0"/>
         <w:jc w:val="left"/>
         <w:rPr>
           <w:rFonts w:ascii="Times New Roman" w:hAnsi="Times New Roman" w:eastAsia="DejaVu Sans" w:cs="Times New Roman"/>
@@ -26919,6 +26640,7 @@
         <w:pStyle w:val="Heading3"/>
         <w:suppressAutoHyphens w:val="true"/>
         <w:spacing w:before="0" w:after="160"/>
+        <w:ind w:hanging="0" w:left="0"/>
         <w:rPr>
           <w:rFonts w:ascii="Times New Roman" w:hAnsi="Times New Roman" w:cs="Times New Roman"/>
           <w:color w:val="auto"/>
@@ -27006,6 +26728,7 @@
         <w:pStyle w:val="Heading3"/>
         <w:suppressAutoHyphens w:val="true"/>
         <w:spacing w:before="0" w:after="160"/>
+        <w:ind w:hanging="0" w:left="0"/>
         <w:rPr>
           <w:rFonts w:ascii="Times New Roman" w:hAnsi="Times New Roman" w:cs="Times New Roman"/>
           <w:color w:val="auto"/>
@@ -27086,6 +26809,7 @@
         <w:pStyle w:val="Heading3"/>
         <w:suppressAutoHyphens w:val="true"/>
         <w:spacing w:before="0" w:after="160"/>
+        <w:ind w:hanging="0" w:left="0"/>
         <w:rPr>
           <w:rFonts w:ascii="Times New Roman" w:hAnsi="Times New Roman" w:cs="Times New Roman"/>
           <w:color w:val="auto"/>
@@ -28082,6 +27806,7 @@
       <w:pPr>
         <w:pStyle w:val="Heading3"/>
         <w:spacing w:lineRule="auto" w:line="216"/>
+        <w:ind w:hanging="0" w:left="0"/>
         <w:rPr>
           <w:rFonts w:ascii="Times New Roman" w:hAnsi="Times New Roman" w:cs="Times New Roman"/>
           <w:color w:val="auto"/>
@@ -28652,6 +28377,7 @@
       <w:pPr>
         <w:pStyle w:val="Heading3"/>
         <w:spacing w:lineRule="auto" w:line="216"/>
+        <w:ind w:hanging="0" w:left="0"/>
         <w:rPr>
           <w:rFonts w:ascii="Times New Roman" w:hAnsi="Times New Roman" w:cs="Times New Roman"/>
           <w:color w:val="auto"/>
@@ -28884,7 +28610,7 @@
         <w:pStyle w:val="BodyText"/>
         <w:widowControl/>
         <w:suppressAutoHyphens w:val="true"/>
-        <w:overflowPunct w:val="false"/>
+        <w:overflowPunct w:val="true"/>
         <w:bidi w:val="0"/>
         <w:spacing w:lineRule="auto" w:line="216" w:before="0" w:after="160"/>
         <w:jc w:val="left"/>
@@ -28914,9 +28640,10 @@
         <w:pStyle w:val="Heading3"/>
         <w:widowControl/>
         <w:suppressAutoHyphens w:val="true"/>
-        <w:overflowPunct w:val="false"/>
+        <w:overflowPunct w:val="true"/>
         <w:bidi w:val="0"/>
         <w:spacing w:lineRule="auto" w:line="216" w:before="0" w:after="160"/>
+        <w:ind w:hanging="0" w:left="0"/>
         <w:jc w:val="left"/>
         <w:rPr>
           <w:rFonts w:ascii="Times New Roman" w:hAnsi="Times New Roman" w:eastAsia="DejaVu Sans" w:cs="Times New Roman"/>
@@ -29016,6 +28743,7 @@
       <w:pPr>
         <w:pStyle w:val="Heading3"/>
         <w:spacing w:lineRule="auto" w:line="216" w:before="0" w:after="160"/>
+        <w:ind w:hanging="0" w:left="0"/>
         <w:rPr>
           <w:rFonts w:ascii="Times New Roman" w:hAnsi="Times New Roman" w:cs="Times New Roman"/>
           <w:sz w:val="24"/>
@@ -29157,6 +28885,7 @@
       <w:pPr>
         <w:pStyle w:val="Heading3"/>
         <w:spacing w:lineRule="auto" w:line="216" w:before="0" w:after="160"/>
+        <w:ind w:hanging="0" w:left="0"/>
         <w:rPr>
           <w:rFonts w:ascii="Times New Roman" w:hAnsi="Times New Roman" w:cs="Times New Roman"/>
           <w:sz w:val="24"/>
@@ -29298,6 +29027,7 @@
       <w:pPr>
         <w:pStyle w:val="Heading3"/>
         <w:spacing w:lineRule="auto" w:line="216" w:before="0" w:after="160"/>
+        <w:ind w:hanging="0" w:left="0"/>
         <w:rPr>
           <w:rFonts w:ascii="Times New Roman" w:hAnsi="Times New Roman" w:cs="Times New Roman"/>
           <w:sz w:val="24"/>
@@ -29334,6 +29064,7 @@
       <w:pPr>
         <w:pStyle w:val="Heading4"/>
         <w:spacing w:lineRule="auto" w:line="216" w:before="0" w:after="160"/>
+        <w:ind w:hanging="0" w:left="0"/>
         <w:rPr>
           <w:rFonts w:ascii="Times New Roman" w:hAnsi="Times New Roman" w:cs="Times New Roman"/>
           <w:color w:val="auto"/>
@@ -29480,6 +29211,7 @@
       <w:pPr>
         <w:pStyle w:val="Heading3"/>
         <w:spacing w:lineRule="auto" w:line="216" w:before="0" w:after="160"/>
+        <w:ind w:hanging="0" w:left="0"/>
         <w:rPr>
           <w:rFonts w:ascii="Times New Roman" w:hAnsi="Times New Roman" w:cs="Times New Roman"/>
           <w:sz w:val="24"/>
@@ -29674,14 +29406,133 @@
           <w:b/>
           <w:bCs/>
         </w:rPr>
-        <w:t xml:space="preserve">5.6.1 </w:t>
-      </w:r>
-      <w:r>
+        <w:t>5.6.1  Risk Score Algorithm:</w:t>
+      </w:r>
+    </w:p>
+    <w:p>
+      <w:pPr>
+        <w:pStyle w:val="Normal"/>
+        <w:rPr>
+          <w:b w:val="false"/>
+          <w:bCs w:val="false"/>
+        </w:rPr>
+      </w:pPr>
+      <w:r>
+        <w:rPr>
+          <w:b w:val="false"/>
+          <w:bCs w:val="false"/>
+        </w:rPr>
+        <w:t>burn_rate = avg_daily_spend × 30</w:t>
+      </w:r>
+    </w:p>
+    <w:p>
+      <w:pPr>
+        <w:pStyle w:val="Normal"/>
+        <w:rPr>
+          <w:b w:val="false"/>
+          <w:bCs w:val="false"/>
+        </w:rPr>
+      </w:pPr>
+      <w:r>
+        <w:rPr>
+          <w:b w:val="false"/>
+          <w:bCs w:val="false"/>
+        </w:rPr>
+        <w:t>runway = liquid_assets / burn_rate</w:t>
+      </w:r>
+    </w:p>
+    <w:p>
+      <w:pPr>
+        <w:pStyle w:val="Normal"/>
+        <w:rPr>
+          <w:b w:val="false"/>
+          <w:bCs w:val="false"/>
+        </w:rPr>
+      </w:pPr>
+      <w:r>
+        <w:rPr>
+          <w:b w:val="false"/>
+          <w:bCs w:val="false"/>
+        </w:rPr>
+        <w:t>risk_score =</w:t>
+      </w:r>
+    </w:p>
+    <w:p>
+      <w:pPr>
+        <w:pStyle w:val="Normal"/>
+        <w:rPr>
+          <w:b w:val="false"/>
+          <w:bCs w:val="false"/>
+        </w:rPr>
+      </w:pPr>
+      <w:r>
+        <w:rPr>
+          <w:b w:val="false"/>
+          <w:bCs w:val="false"/>
+        </w:rPr>
+        <w:t xml:space="preserve">    </w:t>
+      </w:r>
+      <w:r>
+        <w:rPr>
+          <w:b w:val="false"/>
+          <w:bCs w:val="false"/>
+        </w:rPr>
+        <w:t>40 * normalize(runway)</w:t>
+      </w:r>
+    </w:p>
+    <w:p>
+      <w:pPr>
+        <w:pStyle w:val="Normal"/>
+        <w:rPr>
+          <w:b w:val="false"/>
+          <w:bCs w:val="false"/>
+        </w:rPr>
+      </w:pPr>
+      <w:r>
+        <w:rPr>
+          <w:b w:val="false"/>
+          <w:bCs w:val="false"/>
+        </w:rPr>
+        <w:t xml:space="preserve">  </w:t>
+      </w:r>
+      <w:r>
+        <w:rPr>
+          <w:b w:val="false"/>
+          <w:bCs w:val="false"/>
+        </w:rPr>
+        <w:t>+ 30 * normalize(stability)</w:t>
+      </w:r>
+    </w:p>
+    <w:p>
+      <w:pPr>
+        <w:pStyle w:val="Normal"/>
+        <w:rPr>
+          <w:b w:val="false"/>
+          <w:bCs w:val="false"/>
+        </w:rPr>
+      </w:pPr>
+      <w:r>
+        <w:rPr>
+          <w:b w:val="false"/>
+          <w:bCs w:val="false"/>
+        </w:rPr>
+        <w:t>+ 30 * savings_ratio</w:t>
+      </w:r>
+    </w:p>
+    <w:p>
+      <w:pPr>
+        <w:pStyle w:val="Normal"/>
         <w:rPr>
           <w:b/>
           <w:bCs/>
         </w:rPr>
-        <w:t xml:space="preserve"> Risk Score Algorithm:</w:t>
+      </w:pPr>
+      <w:r>
+        <w:rPr>
+          <w:b/>
+          <w:bCs/>
+        </w:rPr>
+        <w:t>5.6.2  Goal Feasibility Algorithm:</w:t>
       </w:r>
     </w:p>
     <w:p>
@@ -29697,7 +29548,7 @@
           <w:b w:val="false"/>
           <w:bCs w:val="false"/>
         </w:rPr>
-        <w:t>burn_rate = avg_daily_spend × 30</w:t>
+        <w:t>Uses financial future value:</w:t>
       </w:r>
     </w:p>
     <w:p>
@@ -29713,7 +29564,7 @@
           <w:b w:val="false"/>
           <w:bCs w:val="false"/>
         </w:rPr>
-        <w:t>runway = liquid_assets / burn_rate</w:t>
+        <w:t>FV = current_savings*(1+r)^t + contribution*((1+r)^t – 1)/r</w:t>
       </w:r>
     </w:p>
     <w:p>
@@ -29729,69 +29580,7 @@
           <w:b w:val="false"/>
           <w:bCs w:val="false"/>
         </w:rPr>
-        <w:t>risk_score =</w:t>
-      </w:r>
-    </w:p>
-    <w:p>
-      <w:pPr>
-        <w:pStyle w:val="Normal"/>
-        <w:rPr>
-          <w:b w:val="false"/>
-          <w:bCs w:val="false"/>
-        </w:rPr>
-      </w:pPr>
-      <w:r>
-        <w:rPr>
-          <w:b w:val="false"/>
-          <w:bCs w:val="false"/>
-        </w:rPr>
-        <w:t xml:space="preserve">    </w:t>
-      </w:r>
-      <w:r>
-        <w:rPr>
-          <w:b w:val="false"/>
-          <w:bCs w:val="false"/>
-        </w:rPr>
-        <w:t>40 * normalize(runway)</w:t>
-      </w:r>
-    </w:p>
-    <w:p>
-      <w:pPr>
-        <w:pStyle w:val="Normal"/>
-        <w:rPr>
-          <w:b w:val="false"/>
-          <w:bCs w:val="false"/>
-        </w:rPr>
-      </w:pPr>
-      <w:r>
-        <w:rPr>
-          <w:b w:val="false"/>
-          <w:bCs w:val="false"/>
-        </w:rPr>
-        <w:t xml:space="preserve">  </w:t>
-      </w:r>
-      <w:r>
-        <w:rPr>
-          <w:b w:val="false"/>
-          <w:bCs w:val="false"/>
-        </w:rPr>
-        <w:t>+ 30 * normalize(stability)</w:t>
-      </w:r>
-    </w:p>
-    <w:p>
-      <w:pPr>
-        <w:pStyle w:val="Normal"/>
-        <w:rPr>
-          <w:b w:val="false"/>
-          <w:bCs w:val="false"/>
-        </w:rPr>
-      </w:pPr>
-      <w:r>
-        <w:rPr>
-          <w:b w:val="false"/>
-          <w:bCs w:val="false"/>
-        </w:rPr>
-        <w:t>+ 30 * savings_ratio</w:t>
+        <w:t>Monte Carlo simulation (500 runs) is used to estimate success probability.</w:t>
       </w:r>
     </w:p>
     <w:p>
@@ -29807,127 +29596,7 @@
           <w:b/>
           <w:bCs/>
         </w:rPr>
-        <w:t xml:space="preserve">5.6.2 </w:t>
-      </w:r>
-      <w:r>
-        <w:rPr>
-          <w:b/>
-          <w:bCs/>
-        </w:rPr>
-        <w:t xml:space="preserve"> </w:t>
-      </w:r>
-      <w:r>
-        <w:rPr>
-          <w:b/>
-          <w:bCs/>
-        </w:rPr>
-        <w:t>Goal</w:t>
-      </w:r>
-      <w:r>
-        <w:rPr>
-          <w:b/>
-          <w:bCs/>
-        </w:rPr>
-        <w:t xml:space="preserve"> </w:t>
-      </w:r>
-      <w:r>
-        <w:rPr>
-          <w:b/>
-          <w:bCs/>
-        </w:rPr>
-        <w:t xml:space="preserve">Feasibility </w:t>
-      </w:r>
-      <w:r>
-        <w:rPr>
-          <w:b/>
-          <w:bCs/>
-        </w:rPr>
-        <w:t>Algorithm:</w:t>
-      </w:r>
-    </w:p>
-    <w:p>
-      <w:pPr>
-        <w:pStyle w:val="Normal"/>
-        <w:rPr>
-          <w:b w:val="false"/>
-          <w:bCs w:val="false"/>
-        </w:rPr>
-      </w:pPr>
-      <w:r>
-        <w:rPr>
-          <w:b w:val="false"/>
-          <w:bCs w:val="false"/>
-        </w:rPr>
-        <w:t>Uses financial future value:</w:t>
-      </w:r>
-    </w:p>
-    <w:p>
-      <w:pPr>
-        <w:pStyle w:val="Normal"/>
-        <w:rPr>
-          <w:b w:val="false"/>
-          <w:bCs w:val="false"/>
-        </w:rPr>
-      </w:pPr>
-      <w:r>
-        <w:rPr>
-          <w:b w:val="false"/>
-          <w:bCs w:val="false"/>
-        </w:rPr>
-        <w:t>FV = current_savings*(1+r)^t + contribution*((1+r)^t – 1)/r</w:t>
-      </w:r>
-    </w:p>
-    <w:p>
-      <w:pPr>
-        <w:pStyle w:val="Normal"/>
-        <w:rPr>
-          <w:b w:val="false"/>
-          <w:bCs w:val="false"/>
-        </w:rPr>
-      </w:pPr>
-      <w:r>
-        <w:rPr>
-          <w:b w:val="false"/>
-          <w:bCs w:val="false"/>
-        </w:rPr>
-        <w:t>Monte Carlo simulation (500 runs) is used to estimate success probability.</w:t>
-      </w:r>
-    </w:p>
-    <w:p>
-      <w:pPr>
-        <w:pStyle w:val="Normal"/>
-        <w:rPr>
-          <w:b/>
-          <w:bCs/>
-        </w:rPr>
-      </w:pPr>
-      <w:r>
-        <w:rPr>
-          <w:b/>
-          <w:bCs/>
-        </w:rPr>
-        <w:t>5.6.3</w:t>
-      </w:r>
-      <w:r>
-        <w:rPr>
-          <w:b/>
-          <w:bCs/>
-        </w:rPr>
-        <w:t xml:space="preserve"> </w:t>
-      </w:r>
-      <w:r>
-        <w:rPr>
-          <w:b/>
-          <w:bCs/>
-        </w:rPr>
-        <w:t>Reinforcement Learning(DQN)</w:t>
-      </w:r>
-      <w:r>
-        <w:rPr>
-          <w:b/>
-          <w:bCs/>
-        </w:rPr>
-        <w:t>:</w:t>
+        <w:t>5.6.3 Reinforcement Learning(DQN):</w:t>
       </w:r>
     </w:p>
     <w:p>
@@ -30462,6 +30131,7 @@
     <w:p>
       <w:pPr>
         <w:pStyle w:val="Heading3"/>
+        <w:ind w:hanging="0" w:left="0"/>
         <w:rPr>
           <w:rFonts w:ascii="Times New Roman" w:hAnsi="Times New Roman" w:cs="Times New Roman"/>
           <w:b w:val="false"/>
@@ -30672,6 +30342,7 @@
       <w:pPr>
         <w:pStyle w:val="Heading3"/>
         <w:spacing w:before="0" w:after="160"/>
+        <w:ind w:hanging="0" w:left="0"/>
         <w:rPr>
           <w:rFonts w:ascii="Times New Roman" w:hAnsi="Times New Roman" w:cs="Times New Roman"/>
         </w:rPr>
@@ -30843,6 +30514,7 @@
     <w:p>
       <w:pPr>
         <w:pStyle w:val="Heading3"/>
+        <w:ind w:hanging="0" w:left="0"/>
         <w:rPr>
           <w:rFonts w:ascii="Times New Roman" w:hAnsi="Times New Roman" w:cs="Times New Roman"/>
           <w:b w:val="false"/>
@@ -31007,6 +30679,7 @@
       <w:pPr>
         <w:pStyle w:val="Heading3"/>
         <w:spacing w:before="0" w:after="160"/>
+        <w:ind w:hanging="0" w:left="0"/>
         <w:rPr>
           <w:rFonts w:ascii="Times New Roman" w:hAnsi="Times New Roman" w:cs="Times New Roman"/>
         </w:rPr>
@@ -35814,6 +35487,7 @@
       <w:pPr>
         <w:pStyle w:val="Heading3"/>
         <w:spacing w:before="0" w:after="160"/>
+        <w:ind w:hanging="0" w:left="0"/>
         <w:rPr>
           <w:rFonts w:ascii="Times New Roman" w:hAnsi="Times New Roman" w:cs="Times New Roman"/>
           <w:color w:val="auto"/>
@@ -35982,14 +35656,14 @@
         </w:tblCellMar>
       </w:tblPr>
       <w:tblGrid>
-        <w:gridCol w:w="2060"/>
-        <w:gridCol w:w="6966"/>
+        <w:gridCol w:w="2057"/>
+        <w:gridCol w:w="6969"/>
       </w:tblGrid>
       <w:tr>
         <w:trPr/>
         <w:tc>
           <w:tcPr>
-            <w:tcW w:w="2060" w:type="dxa"/>
+            <w:tcW w:w="2057" w:type="dxa"/>
             <w:tcBorders/>
           </w:tcPr>
           <w:p>
@@ -36012,7 +35686,7 @@
         </w:tc>
         <w:tc>
           <w:tcPr>
-            <w:tcW w:w="6966" w:type="dxa"/>
+            <w:tcW w:w="6969" w:type="dxa"/>
             <w:tcBorders/>
           </w:tcPr>
           <w:p>
@@ -36038,7 +35712,7 @@
         <w:trPr/>
         <w:tc>
           <w:tcPr>
-            <w:tcW w:w="2060" w:type="dxa"/>
+            <w:tcW w:w="2057" w:type="dxa"/>
             <w:tcBorders/>
           </w:tcPr>
           <w:p>
@@ -36055,7 +35729,7 @@
         </w:tc>
         <w:tc>
           <w:tcPr>
-            <w:tcW w:w="6966" w:type="dxa"/>
+            <w:tcW w:w="6969" w:type="dxa"/>
             <w:tcBorders/>
           </w:tcPr>
           <w:p>
@@ -36075,7 +35749,7 @@
         <w:trPr/>
         <w:tc>
           <w:tcPr>
-            <w:tcW w:w="2060" w:type="dxa"/>
+            <w:tcW w:w="2057" w:type="dxa"/>
             <w:tcBorders/>
           </w:tcPr>
           <w:p>
@@ -36092,7 +35766,7 @@
         </w:tc>
         <w:tc>
           <w:tcPr>
-            <w:tcW w:w="6966" w:type="dxa"/>
+            <w:tcW w:w="6969" w:type="dxa"/>
             <w:tcBorders/>
           </w:tcPr>
           <w:p>
@@ -36112,7 +35786,7 @@
         <w:trPr/>
         <w:tc>
           <w:tcPr>
-            <w:tcW w:w="2060" w:type="dxa"/>
+            <w:tcW w:w="2057" w:type="dxa"/>
             <w:tcBorders/>
           </w:tcPr>
           <w:p>
@@ -36123,13 +35797,13 @@
             </w:pPr>
             <w:r>
               <w:rPr/>
-              <w:t xml:space="preserve">Recall </w:t>
+              <w:t>Recall</w:t>
             </w:r>
           </w:p>
         </w:tc>
         <w:tc>
           <w:tcPr>
-            <w:tcW w:w="6966" w:type="dxa"/>
+            <w:tcW w:w="6969" w:type="dxa"/>
             <w:tcBorders/>
           </w:tcPr>
           <w:p>
@@ -36149,7 +35823,7 @@
         <w:trPr/>
         <w:tc>
           <w:tcPr>
-            <w:tcW w:w="2060" w:type="dxa"/>
+            <w:tcW w:w="2057" w:type="dxa"/>
             <w:tcBorders/>
           </w:tcPr>
           <w:p>
@@ -36166,7 +35840,7 @@
         </w:tc>
         <w:tc>
           <w:tcPr>
-            <w:tcW w:w="6966" w:type="dxa"/>
+            <w:tcW w:w="6969" w:type="dxa"/>
             <w:tcBorders/>
           </w:tcPr>
           <w:p>
@@ -36196,13 +35870,7 @@
         <w:rPr>
           <w:rFonts w:cs="Times New Roman" w:ascii="Times New Roman" w:hAnsi="Times New Roman"/>
         </w:rPr>
-        <w:t>Table</w:t>
-      </w:r>
-      <w:r>
-        <w:rPr>
-          <w:rFonts w:cs="Times New Roman" w:ascii="Times New Roman" w:hAnsi="Times New Roman"/>
-        </w:rPr>
-        <w:t xml:space="preserve"> 1.7 Implementation Flow</w:t>
+        <w:t>Table 1.7 Implementation Flow</w:t>
       </w:r>
     </w:p>
     <w:p>
@@ -36242,6 +35910,7 @@
     <w:p>
       <w:pPr>
         <w:pStyle w:val="Heading3"/>
+        <w:ind w:hanging="0" w:left="0"/>
         <w:rPr>
           <w:rFonts w:ascii="Times New Roman" w:hAnsi="Times New Roman" w:cs="Times New Roman"/>
           <w:b/>
@@ -36984,8 +36653,8 @@
       </w:tblPr>
       <w:tblGrid>
         <w:gridCol w:w="2120"/>
-        <w:gridCol w:w="2620"/>
-        <w:gridCol w:w="4286"/>
+        <w:gridCol w:w="2617"/>
+        <w:gridCol w:w="4289"/>
       </w:tblGrid>
       <w:tr>
         <w:trPr/>
@@ -37018,7 +36687,7 @@
         </w:tc>
         <w:tc>
           <w:tcPr>
-            <w:tcW w:w="2620" w:type="dxa"/>
+            <w:tcW w:w="2617" w:type="dxa"/>
             <w:tcBorders>
               <w:top w:val="single" w:sz="4" w:space="0" w:color="000000"/>
               <w:left w:val="single" w:sz="4" w:space="0" w:color="000000"/>
@@ -37045,7 +36714,7 @@
         </w:tc>
         <w:tc>
           <w:tcPr>
-            <w:tcW w:w="4286" w:type="dxa"/>
+            <w:tcW w:w="4289" w:type="dxa"/>
             <w:tcBorders>
               <w:top w:val="single" w:sz="4" w:space="0" w:color="000000"/>
               <w:left w:val="single" w:sz="4" w:space="0" w:color="000000"/>
@@ -37098,7 +36767,7 @@
         </w:tc>
         <w:tc>
           <w:tcPr>
-            <w:tcW w:w="2620" w:type="dxa"/>
+            <w:tcW w:w="2617" w:type="dxa"/>
             <w:tcBorders>
               <w:left w:val="single" w:sz="4" w:space="0" w:color="000000"/>
               <w:bottom w:val="single" w:sz="4" w:space="0" w:color="000000"/>
@@ -37120,7 +36789,7 @@
         </w:tc>
         <w:tc>
           <w:tcPr>
-            <w:tcW w:w="4286" w:type="dxa"/>
+            <w:tcW w:w="4289" w:type="dxa"/>
             <w:tcBorders>
               <w:left w:val="single" w:sz="4" w:space="0" w:color="000000"/>
               <w:bottom w:val="single" w:sz="4" w:space="0" w:color="000000"/>
@@ -37168,7 +36837,7 @@
         </w:tc>
         <w:tc>
           <w:tcPr>
-            <w:tcW w:w="2620" w:type="dxa"/>
+            <w:tcW w:w="2617" w:type="dxa"/>
             <w:tcBorders>
               <w:left w:val="single" w:sz="4" w:space="0" w:color="000000"/>
               <w:bottom w:val="single" w:sz="4" w:space="0" w:color="000000"/>
@@ -37190,7 +36859,7 @@
         </w:tc>
         <w:tc>
           <w:tcPr>
-            <w:tcW w:w="4286" w:type="dxa"/>
+            <w:tcW w:w="4289" w:type="dxa"/>
             <w:tcBorders>
               <w:left w:val="single" w:sz="4" w:space="0" w:color="000000"/>
               <w:bottom w:val="single" w:sz="4" w:space="0" w:color="000000"/>
@@ -37238,7 +36907,7 @@
         </w:tc>
         <w:tc>
           <w:tcPr>
-            <w:tcW w:w="2620" w:type="dxa"/>
+            <w:tcW w:w="2617" w:type="dxa"/>
             <w:tcBorders>
               <w:left w:val="single" w:sz="4" w:space="0" w:color="000000"/>
               <w:bottom w:val="single" w:sz="4" w:space="0" w:color="000000"/>
@@ -37260,7 +36929,7 @@
         </w:tc>
         <w:tc>
           <w:tcPr>
-            <w:tcW w:w="4286" w:type="dxa"/>
+            <w:tcW w:w="4289" w:type="dxa"/>
             <w:tcBorders>
               <w:left w:val="single" w:sz="4" w:space="0" w:color="000000"/>
               <w:bottom w:val="single" w:sz="4" w:space="0" w:color="000000"/>
@@ -37308,7 +36977,7 @@
         </w:tc>
         <w:tc>
           <w:tcPr>
-            <w:tcW w:w="2620" w:type="dxa"/>
+            <w:tcW w:w="2617" w:type="dxa"/>
             <w:tcBorders>
               <w:left w:val="single" w:sz="4" w:space="0" w:color="000000"/>
               <w:bottom w:val="single" w:sz="4" w:space="0" w:color="000000"/>
@@ -37330,7 +36999,7 @@
         </w:tc>
         <w:tc>
           <w:tcPr>
-            <w:tcW w:w="4286" w:type="dxa"/>
+            <w:tcW w:w="4289" w:type="dxa"/>
             <w:tcBorders>
               <w:left w:val="single" w:sz="4" w:space="0" w:color="000000"/>
               <w:bottom w:val="single" w:sz="4" w:space="0" w:color="000000"/>
@@ -37378,7 +37047,7 @@
         </w:tc>
         <w:tc>
           <w:tcPr>
-            <w:tcW w:w="2620" w:type="dxa"/>
+            <w:tcW w:w="2617" w:type="dxa"/>
             <w:tcBorders>
               <w:left w:val="single" w:sz="4" w:space="0" w:color="000000"/>
               <w:bottom w:val="single" w:sz="4" w:space="0" w:color="000000"/>
@@ -37400,7 +37069,7 @@
         </w:tc>
         <w:tc>
           <w:tcPr>
-            <w:tcW w:w="4286" w:type="dxa"/>
+            <w:tcW w:w="4289" w:type="dxa"/>
             <w:tcBorders>
               <w:left w:val="single" w:sz="4" w:space="0" w:color="000000"/>
               <w:bottom w:val="single" w:sz="4" w:space="0" w:color="000000"/>
@@ -37439,34 +37108,7 @@
           <w:b w:val="false"/>
           <w:bCs w:val="false"/>
         </w:rPr>
-        <w:t>Table</w:t>
-      </w:r>
-      <w:r>
-        <w:rPr>
-          <w:rStyle w:val="Strong"/>
-          <w:rFonts w:cs="Times New Roman" w:ascii="Times New Roman" w:hAnsi="Times New Roman"/>
-          <w:b w:val="false"/>
-          <w:bCs w:val="false"/>
-        </w:rPr>
-        <w:t xml:space="preserve"> 1.</w:t>
-      </w:r>
-      <w:r>
-        <w:rPr>
-          <w:rStyle w:val="Strong"/>
-          <w:rFonts w:cs="Times New Roman" w:ascii="Times New Roman" w:hAnsi="Times New Roman"/>
-          <w:b w:val="false"/>
-          <w:bCs w:val="false"/>
-        </w:rPr>
-        <w:t>8</w:t>
-      </w:r>
-      <w:r>
-        <w:rPr>
-          <w:rStyle w:val="Strong"/>
-          <w:rFonts w:cs="Times New Roman" w:ascii="Times New Roman" w:hAnsi="Times New Roman"/>
-          <w:b w:val="false"/>
-          <w:bCs w:val="false"/>
-        </w:rPr>
-        <w:t xml:space="preserve"> Implementation Flow</w:t>
+        <w:t>Table 1.8 Implementation Flow</w:t>
       </w:r>
     </w:p>
     <w:p>
@@ -39642,6 +39284,7 @@
       <w:pPr>
         <w:pStyle w:val="Heading3"/>
         <w:spacing w:before="0" w:after="160"/>
+        <w:ind w:hanging="0" w:left="0"/>
         <w:rPr>
           <w:color w:val="auto"/>
           <w:sz w:val="24"/>
@@ -39702,6 +39345,7 @@
       <w:pPr>
         <w:pStyle w:val="Heading3"/>
         <w:spacing w:before="0" w:after="160"/>
+        <w:ind w:hanging="0" w:left="0"/>
         <w:rPr>
           <w:color w:val="auto"/>
           <w:sz w:val="24"/>
@@ -39842,6 +39486,7 @@
       <w:pPr>
         <w:pStyle w:val="Heading3"/>
         <w:spacing w:before="0" w:after="160"/>
+        <w:ind w:hanging="0" w:left="0"/>
         <w:rPr>
           <w:color w:val="auto"/>
           <w:sz w:val="24"/>
@@ -39968,6 +39613,7 @@
       <w:pPr>
         <w:pStyle w:val="Heading3"/>
         <w:spacing w:before="0" w:after="160"/>
+        <w:ind w:hanging="0" w:left="0"/>
         <w:rPr>
           <w:color w:val="auto"/>
           <w:sz w:val="24"/>
@@ -40038,6 +39684,7 @@
       <w:pPr>
         <w:pStyle w:val="Heading3"/>
         <w:spacing w:before="0" w:after="160"/>
+        <w:ind w:hanging="0" w:left="0"/>
         <w:rPr>
           <w:color w:val="auto"/>
           <w:sz w:val="24"/>
@@ -40917,6 +40564,7 @@
     <w:p>
       <w:pPr>
         <w:pStyle w:val="Heading3"/>
+        <w:ind w:hanging="0" w:left="0"/>
         <w:rPr>
           <w:rFonts w:ascii="Times New Roman" w:hAnsi="Times New Roman" w:cs="Times New Roman"/>
           <w:lang w:val="en-US"/>
@@ -41232,6 +40880,7 @@
     <w:p>
       <w:pPr>
         <w:pStyle w:val="Heading3"/>
+        <w:ind w:hanging="0" w:left="0"/>
         <w:rPr>
           <w:rFonts w:ascii="Times New Roman" w:hAnsi="Times New Roman" w:cs="Times New Roman"/>
           <w:lang w:val="en-US"/>
@@ -41456,14 +41105,14 @@
         </w:tblCellMar>
       </w:tblPr>
       <w:tblGrid>
-        <w:gridCol w:w="2400"/>
-        <w:gridCol w:w="6626"/>
+        <w:gridCol w:w="2399"/>
+        <w:gridCol w:w="6627"/>
       </w:tblGrid>
       <w:tr>
         <w:trPr/>
         <w:tc>
           <w:tcPr>
-            <w:tcW w:w="2400" w:type="dxa"/>
+            <w:tcW w:w="2399" w:type="dxa"/>
             <w:tcBorders>
               <w:top w:val="single" w:sz="4" w:space="0" w:color="000000"/>
               <w:left w:val="single" w:sz="4" w:space="0" w:color="000000"/>
@@ -41490,7 +41139,7 @@
         </w:tc>
         <w:tc>
           <w:tcPr>
-            <w:tcW w:w="6626" w:type="dxa"/>
+            <w:tcW w:w="6627" w:type="dxa"/>
             <w:tcBorders>
               <w:top w:val="single" w:sz="4" w:space="0" w:color="000000"/>
               <w:left w:val="single" w:sz="4" w:space="0" w:color="000000"/>
@@ -41521,7 +41170,7 @@
         <w:trPr/>
         <w:tc>
           <w:tcPr>
-            <w:tcW w:w="2400" w:type="dxa"/>
+            <w:tcW w:w="2399" w:type="dxa"/>
             <w:tcBorders>
               <w:left w:val="single" w:sz="4" w:space="0" w:color="000000"/>
               <w:bottom w:val="single" w:sz="4" w:space="0" w:color="000000"/>
@@ -41541,7 +41190,7 @@
         </w:tc>
         <w:tc>
           <w:tcPr>
-            <w:tcW w:w="6626" w:type="dxa"/>
+            <w:tcW w:w="6627" w:type="dxa"/>
             <w:tcBorders>
               <w:left w:val="single" w:sz="4" w:space="0" w:color="000000"/>
               <w:bottom w:val="single" w:sz="4" w:space="0" w:color="000000"/>
@@ -41565,7 +41214,7 @@
         <w:trPr/>
         <w:tc>
           <w:tcPr>
-            <w:tcW w:w="2400" w:type="dxa"/>
+            <w:tcW w:w="2399" w:type="dxa"/>
             <w:tcBorders>
               <w:left w:val="single" w:sz="4" w:space="0" w:color="000000"/>
               <w:bottom w:val="single" w:sz="4" w:space="0" w:color="000000"/>
@@ -41585,7 +41234,7 @@
         </w:tc>
         <w:tc>
           <w:tcPr>
-            <w:tcW w:w="6626" w:type="dxa"/>
+            <w:tcW w:w="6627" w:type="dxa"/>
             <w:tcBorders>
               <w:left w:val="single" w:sz="4" w:space="0" w:color="000000"/>
               <w:bottom w:val="single" w:sz="4" w:space="0" w:color="000000"/>
@@ -41611,7 +41260,7 @@
         <w:trPr/>
         <w:tc>
           <w:tcPr>
-            <w:tcW w:w="2400" w:type="dxa"/>
+            <w:tcW w:w="2399" w:type="dxa"/>
             <w:tcBorders>
               <w:left w:val="single" w:sz="4" w:space="0" w:color="000000"/>
               <w:bottom w:val="single" w:sz="4" w:space="0" w:color="000000"/>
@@ -41631,7 +41280,7 @@
         </w:tc>
         <w:tc>
           <w:tcPr>
-            <w:tcW w:w="6626" w:type="dxa"/>
+            <w:tcW w:w="6627" w:type="dxa"/>
             <w:tcBorders>
               <w:left w:val="single" w:sz="4" w:space="0" w:color="000000"/>
               <w:bottom w:val="single" w:sz="4" w:space="0" w:color="000000"/>
@@ -41657,7 +41306,7 @@
         <w:trPr/>
         <w:tc>
           <w:tcPr>
-            <w:tcW w:w="2400" w:type="dxa"/>
+            <w:tcW w:w="2399" w:type="dxa"/>
             <w:tcBorders>
               <w:left w:val="single" w:sz="4" w:space="0" w:color="000000"/>
               <w:bottom w:val="single" w:sz="4" w:space="0" w:color="000000"/>
@@ -41677,7 +41326,7 @@
         </w:tc>
         <w:tc>
           <w:tcPr>
-            <w:tcW w:w="6626" w:type="dxa"/>
+            <w:tcW w:w="6627" w:type="dxa"/>
             <w:tcBorders>
               <w:left w:val="single" w:sz="4" w:space="0" w:color="000000"/>
               <w:bottom w:val="single" w:sz="4" w:space="0" w:color="000000"/>
@@ -41703,7 +41352,7 @@
         <w:trPr/>
         <w:tc>
           <w:tcPr>
-            <w:tcW w:w="2400" w:type="dxa"/>
+            <w:tcW w:w="2399" w:type="dxa"/>
             <w:tcBorders>
               <w:left w:val="single" w:sz="4" w:space="0" w:color="000000"/>
               <w:bottom w:val="single" w:sz="4" w:space="0" w:color="000000"/>
@@ -41723,7 +41372,7 @@
         </w:tc>
         <w:tc>
           <w:tcPr>
-            <w:tcW w:w="6626" w:type="dxa"/>
+            <w:tcW w:w="6627" w:type="dxa"/>
             <w:tcBorders>
               <w:left w:val="single" w:sz="4" w:space="0" w:color="000000"/>
               <w:bottom w:val="single" w:sz="4" w:space="0" w:color="000000"/>
@@ -41749,7 +41398,7 @@
         <w:trPr/>
         <w:tc>
           <w:tcPr>
-            <w:tcW w:w="2400" w:type="dxa"/>
+            <w:tcW w:w="2399" w:type="dxa"/>
             <w:tcBorders>
               <w:left w:val="single" w:sz="4" w:space="0" w:color="000000"/>
               <w:bottom w:val="single" w:sz="4" w:space="0" w:color="000000"/>
@@ -41769,7 +41418,7 @@
         </w:tc>
         <w:tc>
           <w:tcPr>
-            <w:tcW w:w="6626" w:type="dxa"/>
+            <w:tcW w:w="6627" w:type="dxa"/>
             <w:tcBorders>
               <w:left w:val="single" w:sz="4" w:space="0" w:color="000000"/>
               <w:bottom w:val="single" w:sz="4" w:space="0" w:color="000000"/>
@@ -41795,7 +41444,7 @@
         <w:trPr/>
         <w:tc>
           <w:tcPr>
-            <w:tcW w:w="2400" w:type="dxa"/>
+            <w:tcW w:w="2399" w:type="dxa"/>
             <w:tcBorders>
               <w:left w:val="single" w:sz="4" w:space="0" w:color="000000"/>
               <w:bottom w:val="single" w:sz="4" w:space="0" w:color="000000"/>
@@ -41815,7 +41464,7 @@
         </w:tc>
         <w:tc>
           <w:tcPr>
-            <w:tcW w:w="6626" w:type="dxa"/>
+            <w:tcW w:w="6627" w:type="dxa"/>
             <w:tcBorders>
               <w:left w:val="single" w:sz="4" w:space="0" w:color="000000"/>
               <w:bottom w:val="single" w:sz="4" w:space="0" w:color="000000"/>
@@ -41841,7 +41490,7 @@
         <w:trPr/>
         <w:tc>
           <w:tcPr>
-            <w:tcW w:w="2400" w:type="dxa"/>
+            <w:tcW w:w="2399" w:type="dxa"/>
             <w:tcBorders>
               <w:left w:val="single" w:sz="4" w:space="0" w:color="000000"/>
               <w:bottom w:val="single" w:sz="4" w:space="0" w:color="000000"/>
@@ -41861,7 +41510,7 @@
         </w:tc>
         <w:tc>
           <w:tcPr>
-            <w:tcW w:w="6626" w:type="dxa"/>
+            <w:tcW w:w="6627" w:type="dxa"/>
             <w:tcBorders>
               <w:left w:val="single" w:sz="4" w:space="0" w:color="000000"/>
               <w:bottom w:val="single" w:sz="4" w:space="0" w:color="000000"/>
@@ -41887,7 +41536,7 @@
         <w:trPr/>
         <w:tc>
           <w:tcPr>
-            <w:tcW w:w="2400" w:type="dxa"/>
+            <w:tcW w:w="2399" w:type="dxa"/>
             <w:tcBorders>
               <w:left w:val="single" w:sz="4" w:space="0" w:color="000000"/>
               <w:bottom w:val="single" w:sz="4" w:space="0" w:color="000000"/>
@@ -41907,7 +41556,7 @@
         </w:tc>
         <w:tc>
           <w:tcPr>
-            <w:tcW w:w="6626" w:type="dxa"/>
+            <w:tcW w:w="6627" w:type="dxa"/>
             <w:tcBorders>
               <w:left w:val="single" w:sz="4" w:space="0" w:color="000000"/>
               <w:bottom w:val="single" w:sz="4" w:space="0" w:color="000000"/>
@@ -41979,14 +41628,14 @@
         </w:tblCellMar>
       </w:tblPr>
       <w:tblGrid>
-        <w:gridCol w:w="2400"/>
-        <w:gridCol w:w="6626"/>
+        <w:gridCol w:w="2399"/>
+        <w:gridCol w:w="6627"/>
       </w:tblGrid>
       <w:tr>
         <w:trPr/>
         <w:tc>
           <w:tcPr>
-            <w:tcW w:w="2400" w:type="dxa"/>
+            <w:tcW w:w="2399" w:type="dxa"/>
             <w:tcBorders>
               <w:top w:val="single" w:sz="4" w:space="0" w:color="000000"/>
               <w:left w:val="single" w:sz="4" w:space="0" w:color="000000"/>
@@ -42007,7 +41656,7 @@
         </w:tc>
         <w:tc>
           <w:tcPr>
-            <w:tcW w:w="6626" w:type="dxa"/>
+            <w:tcW w:w="6627" w:type="dxa"/>
             <w:tcBorders>
               <w:top w:val="single" w:sz="4" w:space="0" w:color="000000"/>
               <w:left w:val="single" w:sz="4" w:space="0" w:color="000000"/>
@@ -42032,7 +41681,7 @@
         <w:trPr/>
         <w:tc>
           <w:tcPr>
-            <w:tcW w:w="2400" w:type="dxa"/>
+            <w:tcW w:w="2399" w:type="dxa"/>
             <w:tcBorders>
               <w:left w:val="single" w:sz="4" w:space="0" w:color="000000"/>
               <w:bottom w:val="single" w:sz="4" w:space="0" w:color="000000"/>
@@ -42052,7 +41701,7 @@
         </w:tc>
         <w:tc>
           <w:tcPr>
-            <w:tcW w:w="6626" w:type="dxa"/>
+            <w:tcW w:w="6627" w:type="dxa"/>
             <w:tcBorders>
               <w:left w:val="single" w:sz="4" w:space="0" w:color="000000"/>
               <w:bottom w:val="single" w:sz="4" w:space="0" w:color="000000"/>
@@ -42076,7 +41725,7 @@
         <w:trPr/>
         <w:tc>
           <w:tcPr>
-            <w:tcW w:w="2400" w:type="dxa"/>
+            <w:tcW w:w="2399" w:type="dxa"/>
             <w:tcBorders>
               <w:left w:val="single" w:sz="4" w:space="0" w:color="000000"/>
               <w:bottom w:val="single" w:sz="4" w:space="0" w:color="000000"/>
@@ -42096,7 +41745,7 @@
         </w:tc>
         <w:tc>
           <w:tcPr>
-            <w:tcW w:w="6626" w:type="dxa"/>
+            <w:tcW w:w="6627" w:type="dxa"/>
             <w:tcBorders>
               <w:left w:val="single" w:sz="4" w:space="0" w:color="000000"/>
               <w:bottom w:val="single" w:sz="4" w:space="0" w:color="000000"/>
@@ -42120,7 +41769,7 @@
         <w:trPr/>
         <w:tc>
           <w:tcPr>
-            <w:tcW w:w="2400" w:type="dxa"/>
+            <w:tcW w:w="2399" w:type="dxa"/>
             <w:tcBorders>
               <w:left w:val="single" w:sz="4" w:space="0" w:color="000000"/>
               <w:bottom w:val="single" w:sz="4" w:space="0" w:color="000000"/>
@@ -42140,7 +41789,7 @@
         </w:tc>
         <w:tc>
           <w:tcPr>
-            <w:tcW w:w="6626" w:type="dxa"/>
+            <w:tcW w:w="6627" w:type="dxa"/>
             <w:tcBorders>
               <w:left w:val="single" w:sz="4" w:space="0" w:color="000000"/>
               <w:bottom w:val="single" w:sz="4" w:space="0" w:color="000000"/>
@@ -42164,7 +41813,7 @@
         <w:trPr/>
         <w:tc>
           <w:tcPr>
-            <w:tcW w:w="2400" w:type="dxa"/>
+            <w:tcW w:w="2399" w:type="dxa"/>
             <w:tcBorders>
               <w:left w:val="single" w:sz="4" w:space="0" w:color="000000"/>
               <w:bottom w:val="single" w:sz="4" w:space="0" w:color="000000"/>
@@ -42184,7 +41833,7 @@
         </w:tc>
         <w:tc>
           <w:tcPr>
-            <w:tcW w:w="6626" w:type="dxa"/>
+            <w:tcW w:w="6627" w:type="dxa"/>
             <w:tcBorders>
               <w:left w:val="single" w:sz="4" w:space="0" w:color="000000"/>
               <w:bottom w:val="single" w:sz="4" w:space="0" w:color="000000"/>
@@ -42208,7 +41857,7 @@
         <w:trPr/>
         <w:tc>
           <w:tcPr>
-            <w:tcW w:w="2400" w:type="dxa"/>
+            <w:tcW w:w="2399" w:type="dxa"/>
             <w:tcBorders>
               <w:left w:val="single" w:sz="4" w:space="0" w:color="000000"/>
               <w:bottom w:val="single" w:sz="4" w:space="0" w:color="000000"/>
@@ -42228,7 +41877,7 @@
         </w:tc>
         <w:tc>
           <w:tcPr>
-            <w:tcW w:w="6626" w:type="dxa"/>
+            <w:tcW w:w="6627" w:type="dxa"/>
             <w:tcBorders>
               <w:left w:val="single" w:sz="4" w:space="0" w:color="000000"/>
               <w:bottom w:val="single" w:sz="4" w:space="0" w:color="000000"/>
@@ -42252,7 +41901,7 @@
         <w:trPr/>
         <w:tc>
           <w:tcPr>
-            <w:tcW w:w="2400" w:type="dxa"/>
+            <w:tcW w:w="2399" w:type="dxa"/>
             <w:tcBorders>
               <w:left w:val="single" w:sz="4" w:space="0" w:color="000000"/>
               <w:bottom w:val="single" w:sz="4" w:space="0" w:color="000000"/>
@@ -42272,7 +41921,7 @@
         </w:tc>
         <w:tc>
           <w:tcPr>
-            <w:tcW w:w="6626" w:type="dxa"/>
+            <w:tcW w:w="6627" w:type="dxa"/>
             <w:tcBorders>
               <w:left w:val="single" w:sz="4" w:space="0" w:color="000000"/>
               <w:bottom w:val="single" w:sz="4" w:space="0" w:color="000000"/>
@@ -42673,6 +42322,7 @@
     <w:p>
       <w:pPr>
         <w:pStyle w:val="Heading3"/>
+        <w:ind w:hanging="0" w:left="0"/>
         <w:rPr>
           <w:rFonts w:ascii="Times New Roman" w:hAnsi="Times New Roman" w:cs="Times New Roman"/>
           <w:lang w:val="en-US"/>
@@ -42764,6 +42414,7 @@
       <w:pPr>
         <w:pStyle w:val="Heading3"/>
         <w:spacing w:lineRule="auto" w:line="278" w:before="0" w:after="160"/>
+        <w:ind w:hanging="0" w:left="0"/>
         <w:rPr>
           <w:rFonts w:ascii="Times New Roman" w:hAnsi="Times New Roman" w:cs="Times New Roman"/>
           <w:lang w:val="en-US"/>
@@ -42907,6 +42558,7 @@
     <w:p>
       <w:pPr>
         <w:pStyle w:val="Heading3"/>
+        <w:ind w:hanging="0" w:left="0"/>
         <w:rPr>
           <w:rFonts w:ascii="Times New Roman" w:hAnsi="Times New Roman" w:cs="Times New Roman"/>
           <w:lang w:val="en-US"/>
@@ -44104,6 +43756,7 @@
     <w:p>
       <w:pPr>
         <w:pStyle w:val="Heading3"/>
+        <w:ind w:hanging="0" w:left="0"/>
         <w:rPr>
           <w:rFonts w:ascii="Times New Roman" w:hAnsi="Times New Roman" w:cs="Times New Roman"/>
         </w:rPr>
@@ -44237,13 +43890,16 @@
       </w:r>
     </w:p>
     <w:sectPr>
+      <w:footerReference w:type="even" r:id="rId3"/>
+      <w:footerReference w:type="default" r:id="rId4"/>
+      <w:footerReference w:type="first" r:id="rId5"/>
       <w:type w:val="nextPage"/>
       <w:pgSz w:w="11906" w:h="16838"/>
-      <w:pgMar w:left="1440" w:right="1440" w:gutter="0" w:header="0" w:top="1440" w:footer="0" w:bottom="1440"/>
+      <w:pgMar w:left="1440" w:right="1440" w:gutter="0" w:header="0" w:top="1440" w:footer="1243" w:bottom="1852"/>
       <w:pgBorders w:display="allPages" w:offsetFrom="page">
         <w:top w:val="single" w:sz="4" w:space="24" w:color="000000"/>
         <w:left w:val="single" w:sz="4" w:space="24" w:color="000000"/>
-        <w:bottom w:val="single" w:sz="4" w:space="24" w:color="000000"/>
+        <w:bottom w:val="single" w:sz="4" w:space="14" w:color="000000"/>
         <w:right w:val="single" w:sz="4" w:space="24" w:color="000000"/>
       </w:pgBorders>
       <w:pgNumType w:fmt="decimal"/>
@@ -44255,6 +43911,50 @@
 </w:document>
 </file>
 
+<file path=word/footer1.xml><?xml version="1.0" encoding="utf-8"?>
+<w:ftr xmlns:o="urn:schemas-microsoft-com:office:office" xmlns:r="http://schemas.openxmlformats.org/officeDocument/2006/relationships" xmlns:v="urn:schemas-microsoft-com:vml" xmlns:w="http://schemas.openxmlformats.org/wordprocessingml/2006/main" xmlns:w10="urn:schemas-microsoft-com:office:word" xmlns:wp="http://schemas.openxmlformats.org/drawingml/2006/wordprocessingDrawing" xmlns:pic="http://schemas.openxmlformats.org/drawingml/2006/picture" xmlns:wps="http://schemas.microsoft.com/office/word/2010/wordprocessingShape" xmlns:wpg="http://schemas.microsoft.com/office/word/2010/wordprocessingGroup" xmlns:mc="http://schemas.openxmlformats.org/markup-compatibility/2006" xmlns:wp14="http://schemas.microsoft.com/office/word/2010/wordprocessingDrawing" xmlns:w14="http://schemas.microsoft.com/office/word/2010/wordml" xmlns:w15="http://schemas.microsoft.com/office/word/2012/wordml" mc:Ignorable="w14 wp14 w15">
+  <w:p>
+    <w:pPr>
+      <w:pStyle w:val="Footer"/>
+      <w:rPr/>
+    </w:pPr>
+    <w:r>
+      <w:rPr/>
+    </w:r>
+  </w:p>
+</w:ftr>
+</file>
+
+<file path=word/footer2.xml><?xml version="1.0" encoding="utf-8"?>
+<w:ftr xmlns:o="urn:schemas-microsoft-com:office:office" xmlns:r="http://schemas.openxmlformats.org/officeDocument/2006/relationships" xmlns:v="urn:schemas-microsoft-com:vml" xmlns:w="http://schemas.openxmlformats.org/wordprocessingml/2006/main" xmlns:w10="urn:schemas-microsoft-com:office:word" xmlns:wp="http://schemas.openxmlformats.org/drawingml/2006/wordprocessingDrawing" xmlns:pic="http://schemas.openxmlformats.org/drawingml/2006/picture" xmlns:wps="http://schemas.microsoft.com/office/word/2010/wordprocessingShape" xmlns:wpg="http://schemas.microsoft.com/office/word/2010/wordprocessingGroup" xmlns:mc="http://schemas.openxmlformats.org/markup-compatibility/2006" xmlns:wp14="http://schemas.microsoft.com/office/word/2010/wordprocessingDrawing" xmlns:w14="http://schemas.microsoft.com/office/word/2010/wordml" xmlns:w15="http://schemas.microsoft.com/office/word/2012/wordml" mc:Ignorable="w14 wp14 w15">
+  <w:p>
+    <w:pPr>
+      <w:pStyle w:val="Footer"/>
+      <w:jc w:val="center"/>
+      <w:rPr/>
+    </w:pPr>
+    <w:r>
+      <w:rPr/>
+    </w:r>
+  </w:p>
+</w:ftr>
+</file>
+
+<file path=word/footer3.xml><?xml version="1.0" encoding="utf-8"?>
+<w:ftr xmlns:o="urn:schemas-microsoft-com:office:office" xmlns:r="http://schemas.openxmlformats.org/officeDocument/2006/relationships" xmlns:v="urn:schemas-microsoft-com:vml" xmlns:w="http://schemas.openxmlformats.org/wordprocessingml/2006/main" xmlns:w10="urn:schemas-microsoft-com:office:word" xmlns:wp="http://schemas.openxmlformats.org/drawingml/2006/wordprocessingDrawing" xmlns:pic="http://schemas.openxmlformats.org/drawingml/2006/picture" xmlns:wps="http://schemas.microsoft.com/office/word/2010/wordprocessingShape" xmlns:wpg="http://schemas.microsoft.com/office/word/2010/wordprocessingGroup" xmlns:mc="http://schemas.openxmlformats.org/markup-compatibility/2006" xmlns:wp14="http://schemas.microsoft.com/office/word/2010/wordprocessingDrawing" xmlns:w14="http://schemas.microsoft.com/office/word/2010/wordml" xmlns:w15="http://schemas.microsoft.com/office/word/2012/wordml" mc:Ignorable="w14 wp14 w15">
+  <w:p>
+    <w:pPr>
+      <w:pStyle w:val="Footer"/>
+      <w:jc w:val="center"/>
+      <w:rPr/>
+    </w:pPr>
+    <w:r>
+      <w:rPr/>
+    </w:r>
+  </w:p>
+</w:ftr>
+</file>
+
 <file path=word/numbering.xml><?xml version="1.0" encoding="utf-8"?>
 <w:numbering xmlns:w="http://schemas.openxmlformats.org/wordprocessingml/2006/main" xmlns:o="urn:schemas-microsoft-com:office:office" xmlns:r="http://schemas.openxmlformats.org/officeDocument/2006/relationships" xmlns:v="urn:schemas-microsoft-com:vml" xmlns:mc="http://schemas.openxmlformats.org/markup-compatibility/2006" xmlns:w14="http://schemas.microsoft.com/office/word/2010/wordml" mc:Ignorable="w14">
   <w:abstractNum w:abstractNumId="1">
@@ -48821,6 +48521,7 @@
         </w:tabs>
         <w:ind w:left="1080" w:hanging="360"/>
       </w:pPr>
+      <w:rPr/>
     </w:lvl>
     <w:lvl w:ilvl="2">
       <w:start w:val="1"/>
@@ -48833,6 +48534,7 @@
         </w:tabs>
         <w:ind w:left="1440" w:hanging="360"/>
       </w:pPr>
+      <w:rPr/>
     </w:lvl>
     <w:lvl w:ilvl="3">
       <w:start w:val="1"/>
@@ -48845,6 +48547,7 @@
         </w:tabs>
         <w:ind w:left="1800" w:hanging="360"/>
       </w:pPr>
+      <w:rPr/>
     </w:lvl>
     <w:lvl w:ilvl="4">
       <w:start w:val="1"/>
@@ -48857,6 +48560,7 @@
         </w:tabs>
         <w:ind w:left="2160" w:hanging="360"/>
       </w:pPr>
+      <w:rPr/>
     </w:lvl>
     <w:lvl w:ilvl="5">
       <w:start w:val="1"/>
@@ -48869,6 +48573,7 @@
         </w:tabs>
         <w:ind w:left="2520" w:hanging="360"/>
       </w:pPr>
+      <w:rPr/>
     </w:lvl>
     <w:lvl w:ilvl="6">
       <w:start w:val="1"/>
@@ -48881,6 +48586,7 @@
         </w:tabs>
         <w:ind w:left="2880" w:hanging="360"/>
       </w:pPr>
+      <w:rPr/>
     </w:lvl>
     <w:lvl w:ilvl="7">
       <w:start w:val="1"/>
@@ -48893,6 +48599,7 @@
         </w:tabs>
         <w:ind w:left="3240" w:hanging="360"/>
       </w:pPr>
+      <w:rPr/>
     </w:lvl>
     <w:lvl w:ilvl="8">
       <w:start w:val="1"/>
@@ -48905,6 +48612,7 @@
         </w:tabs>
         <w:ind w:left="3600" w:hanging="360"/>
       </w:pPr>
+      <w:rPr/>
     </w:lvl>
   </w:abstractNum>
   <w:abstractNum w:abstractNumId="35">
@@ -48934,6 +48642,7 @@
         </w:tabs>
         <w:ind w:left="1080" w:hanging="360"/>
       </w:pPr>
+      <w:rPr/>
     </w:lvl>
     <w:lvl w:ilvl="2">
       <w:start w:val="1"/>
@@ -48946,6 +48655,7 @@
         </w:tabs>
         <w:ind w:left="1440" w:hanging="360"/>
       </w:pPr>
+      <w:rPr/>
     </w:lvl>
     <w:lvl w:ilvl="3">
       <w:start w:val="1"/>
@@ -48958,6 +48668,7 @@
         </w:tabs>
         <w:ind w:left="1800" w:hanging="360"/>
       </w:pPr>
+      <w:rPr/>
     </w:lvl>
     <w:lvl w:ilvl="4">
       <w:start w:val="1"/>
@@ -48970,6 +48681,7 @@
         </w:tabs>
         <w:ind w:left="2160" w:hanging="360"/>
       </w:pPr>
+      <w:rPr/>
     </w:lvl>
     <w:lvl w:ilvl="5">
       <w:start w:val="1"/>
@@ -48982,6 +48694,7 @@
         </w:tabs>
         <w:ind w:left="2520" w:hanging="360"/>
       </w:pPr>
+      <w:rPr/>
     </w:lvl>
     <w:lvl w:ilvl="6">
       <w:start w:val="1"/>
@@ -48994,6 +48707,7 @@
         </w:tabs>
         <w:ind w:left="2880" w:hanging="360"/>
       </w:pPr>
+      <w:rPr/>
     </w:lvl>
     <w:lvl w:ilvl="7">
       <w:start w:val="1"/>
@@ -49006,6 +48720,7 @@
         </w:tabs>
         <w:ind w:left="3240" w:hanging="360"/>
       </w:pPr>
+      <w:rPr/>
     </w:lvl>
     <w:lvl w:ilvl="8">
       <w:start w:val="1"/>
@@ -49018,6 +48733,7 @@
         </w:tabs>
         <w:ind w:left="3600" w:hanging="360"/>
       </w:pPr>
+      <w:rPr/>
     </w:lvl>
   </w:abstractNum>
   <w:abstractNum w:abstractNumId="36">
@@ -51477,6 +51193,7 @@
         </w:tabs>
         <w:ind w:left="1080" w:hanging="360"/>
       </w:pPr>
+      <w:rPr/>
     </w:lvl>
     <w:lvl w:ilvl="2">
       <w:start w:val="1"/>
@@ -51489,6 +51206,7 @@
         </w:tabs>
         <w:ind w:left="1440" w:hanging="360"/>
       </w:pPr>
+      <w:rPr/>
     </w:lvl>
     <w:lvl w:ilvl="3">
       <w:start w:val="1"/>
@@ -51501,6 +51219,7 @@
         </w:tabs>
         <w:ind w:left="1800" w:hanging="360"/>
       </w:pPr>
+      <w:rPr/>
     </w:lvl>
     <w:lvl w:ilvl="4">
       <w:start w:val="1"/>
@@ -51513,6 +51232,7 @@
         </w:tabs>
         <w:ind w:left="2160" w:hanging="360"/>
       </w:pPr>
+      <w:rPr/>
     </w:lvl>
     <w:lvl w:ilvl="5">
       <w:start w:val="1"/>
@@ -51525,6 +51245,7 @@
         </w:tabs>
         <w:ind w:left="2520" w:hanging="360"/>
       </w:pPr>
+      <w:rPr/>
     </w:lvl>
     <w:lvl w:ilvl="6">
       <w:start w:val="1"/>
@@ -51537,6 +51258,7 @@
         </w:tabs>
         <w:ind w:left="2880" w:hanging="360"/>
       </w:pPr>
+      <w:rPr/>
     </w:lvl>
     <w:lvl w:ilvl="7">
       <w:start w:val="1"/>
@@ -51549,6 +51271,7 @@
         </w:tabs>
         <w:ind w:left="3240" w:hanging="360"/>
       </w:pPr>
+      <w:rPr/>
     </w:lvl>
     <w:lvl w:ilvl="8">
       <w:start w:val="1"/>
@@ -51561,6 +51284,7 @@
         </w:tabs>
         <w:ind w:left="3600" w:hanging="360"/>
       </w:pPr>
+      <w:rPr/>
     </w:lvl>
   </w:abstractNum>
   <w:abstractNum w:abstractNumId="55">
@@ -56476,7 +56200,7 @@
     <w:pPr>
       <w:widowControl/>
       <w:suppressAutoHyphens w:val="true"/>
-      <w:overflowPunct w:val="false"/>
+      <w:overflowPunct w:val="true"/>
       <w:bidi w:val="0"/>
       <w:spacing w:lineRule="auto" w:line="278" w:before="0" w:after="160"/>
       <w:jc w:val="left"/>
@@ -56896,15 +56620,15 @@
     <w:qFormat/>
     <w:rPr/>
   </w:style>
-  <w:style w:type="character" w:styleId="Bullets">
-    <w:name w:val="Bullets"/>
+  <w:style w:type="character" w:styleId="Bulletsuser">
+    <w:name w:val="Bullets (user)"/>
     <w:qFormat/>
     <w:rPr>
       <w:rFonts w:ascii="OpenSymbol" w:hAnsi="OpenSymbol" w:eastAsia="OpenSymbol" w:cs="OpenSymbol"/>
     </w:rPr>
   </w:style>
-  <w:style w:type="character" w:styleId="Bulletsuser">
-    <w:name w:val="Bullets (user)"/>
+  <w:style w:type="character" w:styleId="Bullets">
+    <w:name w:val="Bullets"/>
     <w:qFormat/>
     <w:rPr>
       <w:rFonts w:ascii="OpenSymbol" w:hAnsi="OpenSymbol" w:eastAsia="OpenSymbol" w:cs="OpenSymbol"/>

</xml_diff>